<commit_message>
Appendix J: cross-metro CES vs QCEW comparison (10 metros) + paper appendix IV
Q4 2025 survey-vs-tax-records gap is systematic: CES printed below QCEW
in 9 of 10 metros in the shutdown quarter, with the understatement
scaling with actual growth (Boise -1.41pp worst, Austin -1.21, SLC -0.90,
Vegas -0.79; flat metros ~0). Birth-death mechanism explained; docx
rebuilt with new appendix; crossmetro.json saved.

Co-Authored-By: Claude Fable 5 <noreply@anthropic.com>
Claude-Session: https://claude.ai/code/session_018pjKPrYAW2u8zH3WtQwHiV
</commit_message>
<xml_diff>
--- a/employment-drivers/The Boise Slowdown - Research Paper.docx
+++ b/employment-drivers/The Boise Slowdown - Research Paper.docx
@@ -10178,7 +10178,1577 @@
           <w:sz w:val="32"/>
           <w:szCs w:val="32"/>
         </w:rPr>
-        <w:t xml:space="preserve">Appendix IV: Source Base</w:t>
+        <w:t xml:space="preserve">Appendix IV: Cross-Metro CES–QCEW Evidence (added Aug 13, 2026)</w:t>
+      </w:r>
+    </w:p>
+    <w:p>
+      <w:pPr>
+        <w:spacing w:after="120" w:line="276"/>
+        <w:jc w:val="both"/>
+      </w:pPr>
+      <w:r>
+        <w:rPr>
+          <w:rFonts w:ascii="Calibri" w:cs="Calibri" w:eastAsia="Calibri" w:hAnsi="Calibri"/>
+          <w:sz w:val="21"/>
+          <w:szCs w:val="21"/>
+        </w:rPr>
+        <w:t xml:space="preserve">To test whether the Boise survey-vs-tax-records divergence (Finding 1) is idiosyncratic, the same comparison was computed for nine peer metros (full table, method, and mechanism discussion in deal-file appendix J):</w:t>
+      </w:r>
+    </w:p>
+    <w:tbl>
+      <w:tblPr>
+        <w:tblW w:type="dxa" w:w="9360"/>
+        <w:tblBorders>
+          <w:top w:val="single" w:color="9AA69C" w:sz="4"/>
+          <w:left w:val="none"/>
+          <w:bottom w:val="single" w:color="9AA69C" w:sz="4"/>
+          <w:right w:val="none"/>
+          <w:insideH w:val="single" w:color="D5DBD4" w:sz="2"/>
+          <w:insideV w:val="none"/>
+        </w:tblBorders>
+      </w:tblPr>
+      <w:tblGrid>
+        <w:gridCol w:w="3182"/>
+        <w:gridCol w:w="1545"/>
+        <w:gridCol w:w="1545"/>
+        <w:gridCol w:w="1545"/>
+        <w:gridCol w:w="1543"/>
+      </w:tblGrid>
+      <w:tr>
+        <w:trPr>
+          <w:tblHeader/>
+        </w:trPr>
+        <w:tc>
+          <w:tcPr>
+            <w:tcW w:type="dxa" w:w="3182"/>
+            <w:shd w:fill="E8EDE7" w:val="clear"/>
+            <w:tcMar>
+              <w:top w:type="dxa" w:w="60"/>
+              <w:left w:type="dxa" w:w="100"/>
+              <w:bottom w:type="dxa" w:w="60"/>
+              <w:right w:type="dxa" w:w="100"/>
+            </w:tcMar>
+          </w:tcPr>
+          <w:p>
+            <w:pPr>
+              <w:spacing w:after="0"/>
+              <w:jc w:val="left"/>
+            </w:pPr>
+            <w:r>
+              <w:rPr>
+                <w:rFonts w:ascii="Calibri" w:cs="Calibri" w:eastAsia="Calibri" w:hAnsi="Calibri"/>
+                <w:b/>
+                <w:bCs/>
+                <w:sz w:val="18"/>
+                <w:szCs w:val="18"/>
+              </w:rPr>
+              <w:t xml:space="preserve">Metro</w:t>
+            </w:r>
+          </w:p>
+        </w:tc>
+        <w:tc>
+          <w:tcPr>
+            <w:tcW w:type="dxa" w:w="1545"/>
+            <w:shd w:fill="E8EDE7" w:val="clear"/>
+            <w:tcMar>
+              <w:top w:type="dxa" w:w="60"/>
+              <w:left w:type="dxa" w:w="100"/>
+              <w:bottom w:type="dxa" w:w="60"/>
+              <w:right w:type="dxa" w:w="100"/>
+            </w:tcMar>
+          </w:tcPr>
+          <w:p>
+            <w:pPr>
+              <w:spacing w:after="0"/>
+              <w:jc w:val="right"/>
+            </w:pPr>
+            <w:r>
+              <w:rPr>
+                <w:rFonts w:ascii="Calibri" w:cs="Calibri" w:eastAsia="Calibri" w:hAnsi="Calibri"/>
+                <w:b/>
+                <w:bCs/>
+                <w:sz w:val="18"/>
+                <w:szCs w:val="18"/>
+              </w:rPr>
+              <w:t xml:space="preserve">CES T3M Dec-25</w:t>
+            </w:r>
+          </w:p>
+        </w:tc>
+        <w:tc>
+          <w:tcPr>
+            <w:tcW w:type="dxa" w:w="1545"/>
+            <w:shd w:fill="E8EDE7" w:val="clear"/>
+            <w:tcMar>
+              <w:top w:type="dxa" w:w="60"/>
+              <w:left w:type="dxa" w:w="100"/>
+              <w:bottom w:type="dxa" w:w="60"/>
+              <w:right w:type="dxa" w:w="100"/>
+            </w:tcMar>
+          </w:tcPr>
+          <w:p>
+            <w:pPr>
+              <w:spacing w:after="0"/>
+              <w:jc w:val="right"/>
+            </w:pPr>
+            <w:r>
+              <w:rPr>
+                <w:rFonts w:ascii="Calibri" w:cs="Calibri" w:eastAsia="Calibri" w:hAnsi="Calibri"/>
+                <w:b/>
+                <w:bCs/>
+                <w:sz w:val="18"/>
+                <w:szCs w:val="18"/>
+              </w:rPr>
+              <w:t xml:space="preserve">QCEW Q4-25</w:t>
+            </w:r>
+          </w:p>
+        </w:tc>
+        <w:tc>
+          <w:tcPr>
+            <w:tcW w:type="dxa" w:w="1545"/>
+            <w:shd w:fill="E8EDE7" w:val="clear"/>
+            <w:tcMar>
+              <w:top w:type="dxa" w:w="60"/>
+              <w:left w:type="dxa" w:w="100"/>
+              <w:bottom w:type="dxa" w:w="60"/>
+              <w:right w:type="dxa" w:w="100"/>
+            </w:tcMar>
+          </w:tcPr>
+          <w:p>
+            <w:pPr>
+              <w:spacing w:after="0"/>
+              <w:jc w:val="right"/>
+            </w:pPr>
+            <w:r>
+              <w:rPr>
+                <w:rFonts w:ascii="Calibri" w:cs="Calibri" w:eastAsia="Calibri" w:hAnsi="Calibri"/>
+                <w:b/>
+                <w:bCs/>
+                <w:sz w:val="18"/>
+                <w:szCs w:val="18"/>
+              </w:rPr>
+              <w:t xml:space="preserve">Gap</w:t>
+            </w:r>
+          </w:p>
+        </w:tc>
+        <w:tc>
+          <w:tcPr>
+            <w:tcW w:type="dxa" w:w="1543"/>
+            <w:shd w:fill="E8EDE7" w:val="clear"/>
+            <w:tcMar>
+              <w:top w:type="dxa" w:w="60"/>
+              <w:left w:type="dxa" w:w="100"/>
+              <w:bottom w:type="dxa" w:w="60"/>
+              <w:right w:type="dxa" w:w="100"/>
+            </w:tcMar>
+          </w:tcPr>
+          <w:p>
+            <w:pPr>
+              <w:spacing w:after="0"/>
+              <w:jc w:val="right"/>
+            </w:pPr>
+            <w:r>
+              <w:rPr>
+                <w:rFonts w:ascii="Calibri" w:cs="Calibri" w:eastAsia="Calibri" w:hAnsi="Calibri"/>
+                <w:b/>
+                <w:bCs/>
+                <w:sz w:val="18"/>
+                <w:szCs w:val="18"/>
+              </w:rPr>
+              <w:t xml:space="preserve">CES T3M Jun-26</w:t>
+            </w:r>
+          </w:p>
+        </w:tc>
+      </w:tr>
+      <w:tr>
+        <w:trPr>
+          <w:tblHeader w:val="false"/>
+        </w:trPr>
+        <w:tc>
+          <w:tcPr>
+            <w:tcW w:type="dxa" w:w="3182"/>
+            <w:tcMar>
+              <w:top w:type="dxa" w:w="60"/>
+              <w:left w:type="dxa" w:w="100"/>
+              <w:bottom w:type="dxa" w:w="60"/>
+              <w:right w:type="dxa" w:w="100"/>
+            </w:tcMar>
+          </w:tcPr>
+          <w:p>
+            <w:pPr>
+              <w:spacing w:after="0"/>
+              <w:jc w:val="left"/>
+            </w:pPr>
+            <w:r>
+              <w:rPr>
+                <w:rFonts w:ascii="Calibri" w:cs="Calibri" w:eastAsia="Calibri" w:hAnsi="Calibri"/>
+                <w:sz w:val="18"/>
+                <w:szCs w:val="18"/>
+              </w:rPr>
+              <w:t xml:space="preserve">Boise</w:t>
+            </w:r>
+          </w:p>
+        </w:tc>
+        <w:tc>
+          <w:tcPr>
+            <w:tcW w:type="dxa" w:w="1545"/>
+            <w:tcMar>
+              <w:top w:type="dxa" w:w="60"/>
+              <w:left w:type="dxa" w:w="100"/>
+              <w:bottom w:type="dxa" w:w="60"/>
+              <w:right w:type="dxa" w:w="100"/>
+            </w:tcMar>
+          </w:tcPr>
+          <w:p>
+            <w:pPr>
+              <w:spacing w:after="0"/>
+              <w:jc w:val="right"/>
+            </w:pPr>
+            <w:r>
+              <w:rPr>
+                <w:rFonts w:ascii="Calibri" w:cs="Calibri" w:eastAsia="Calibri" w:hAnsi="Calibri"/>
+                <w:sz w:val="18"/>
+                <w:szCs w:val="18"/>
+              </w:rPr>
+              <w:t xml:space="preserve">+0.91%</w:t>
+            </w:r>
+          </w:p>
+        </w:tc>
+        <w:tc>
+          <w:tcPr>
+            <w:tcW w:type="dxa" w:w="1545"/>
+            <w:tcMar>
+              <w:top w:type="dxa" w:w="60"/>
+              <w:left w:type="dxa" w:w="100"/>
+              <w:bottom w:type="dxa" w:w="60"/>
+              <w:right w:type="dxa" w:w="100"/>
+            </w:tcMar>
+          </w:tcPr>
+          <w:p>
+            <w:pPr>
+              <w:spacing w:after="0"/>
+              <w:jc w:val="right"/>
+            </w:pPr>
+            <w:r>
+              <w:rPr>
+                <w:rFonts w:ascii="Calibri" w:cs="Calibri" w:eastAsia="Calibri" w:hAnsi="Calibri"/>
+                <w:sz w:val="18"/>
+                <w:szCs w:val="18"/>
+              </w:rPr>
+              <w:t xml:space="preserve">+2.32%</w:t>
+            </w:r>
+          </w:p>
+        </w:tc>
+        <w:tc>
+          <w:tcPr>
+            <w:tcW w:type="dxa" w:w="1545"/>
+            <w:tcMar>
+              <w:top w:type="dxa" w:w="60"/>
+              <w:left w:type="dxa" w:w="100"/>
+              <w:bottom w:type="dxa" w:w="60"/>
+              <w:right w:type="dxa" w:w="100"/>
+            </w:tcMar>
+          </w:tcPr>
+          <w:p>
+            <w:pPr>
+              <w:spacing w:after="0"/>
+              <w:jc w:val="right"/>
+            </w:pPr>
+            <w:r>
+              <w:rPr>
+                <w:rFonts w:ascii="Calibri" w:cs="Calibri" w:eastAsia="Calibri" w:hAnsi="Calibri"/>
+                <w:sz w:val="18"/>
+                <w:szCs w:val="18"/>
+              </w:rPr>
+              <w:t xml:space="preserve">−1.41</w:t>
+            </w:r>
+          </w:p>
+        </w:tc>
+        <w:tc>
+          <w:tcPr>
+            <w:tcW w:type="dxa" w:w="1543"/>
+            <w:tcMar>
+              <w:top w:type="dxa" w:w="60"/>
+              <w:left w:type="dxa" w:w="100"/>
+              <w:bottom w:type="dxa" w:w="60"/>
+              <w:right w:type="dxa" w:w="100"/>
+            </w:tcMar>
+          </w:tcPr>
+          <w:p>
+            <w:pPr>
+              <w:spacing w:after="0"/>
+              <w:jc w:val="right"/>
+            </w:pPr>
+            <w:r>
+              <w:rPr>
+                <w:rFonts w:ascii="Calibri" w:cs="Calibri" w:eastAsia="Calibri" w:hAnsi="Calibri"/>
+                <w:sz w:val="18"/>
+                <w:szCs w:val="18"/>
+              </w:rPr>
+              <w:t xml:space="preserve">+0.42%</w:t>
+            </w:r>
+          </w:p>
+        </w:tc>
+      </w:tr>
+      <w:tr>
+        <w:trPr>
+          <w:tblHeader w:val="false"/>
+        </w:trPr>
+        <w:tc>
+          <w:tcPr>
+            <w:tcW w:type="dxa" w:w="3182"/>
+            <w:tcMar>
+              <w:top w:type="dxa" w:w="60"/>
+              <w:left w:type="dxa" w:w="100"/>
+              <w:bottom w:type="dxa" w:w="60"/>
+              <w:right w:type="dxa" w:w="100"/>
+            </w:tcMar>
+          </w:tcPr>
+          <w:p>
+            <w:pPr>
+              <w:spacing w:after="0"/>
+              <w:jc w:val="left"/>
+            </w:pPr>
+            <w:r>
+              <w:rPr>
+                <w:rFonts w:ascii="Calibri" w:cs="Calibri" w:eastAsia="Calibri" w:hAnsi="Calibri"/>
+                <w:sz w:val="18"/>
+                <w:szCs w:val="18"/>
+              </w:rPr>
+              <w:t xml:space="preserve">Austin</w:t>
+            </w:r>
+          </w:p>
+        </w:tc>
+        <w:tc>
+          <w:tcPr>
+            <w:tcW w:type="dxa" w:w="1545"/>
+            <w:tcMar>
+              <w:top w:type="dxa" w:w="60"/>
+              <w:left w:type="dxa" w:w="100"/>
+              <w:bottom w:type="dxa" w:w="60"/>
+              <w:right w:type="dxa" w:w="100"/>
+            </w:tcMar>
+          </w:tcPr>
+          <w:p>
+            <w:pPr>
+              <w:spacing w:after="0"/>
+              <w:jc w:val="right"/>
+            </w:pPr>
+            <w:r>
+              <w:rPr>
+                <w:rFonts w:ascii="Calibri" w:cs="Calibri" w:eastAsia="Calibri" w:hAnsi="Calibri"/>
+                <w:sz w:val="18"/>
+                <w:szCs w:val="18"/>
+              </w:rPr>
+              <w:t xml:space="preserve">+1.27%</w:t>
+            </w:r>
+          </w:p>
+        </w:tc>
+        <w:tc>
+          <w:tcPr>
+            <w:tcW w:type="dxa" w:w="1545"/>
+            <w:tcMar>
+              <w:top w:type="dxa" w:w="60"/>
+              <w:left w:type="dxa" w:w="100"/>
+              <w:bottom w:type="dxa" w:w="60"/>
+              <w:right w:type="dxa" w:w="100"/>
+            </w:tcMar>
+          </w:tcPr>
+          <w:p>
+            <w:pPr>
+              <w:spacing w:after="0"/>
+              <w:jc w:val="right"/>
+            </w:pPr>
+            <w:r>
+              <w:rPr>
+                <w:rFonts w:ascii="Calibri" w:cs="Calibri" w:eastAsia="Calibri" w:hAnsi="Calibri"/>
+                <w:sz w:val="18"/>
+                <w:szCs w:val="18"/>
+              </w:rPr>
+              <w:t xml:space="preserve">+2.48%</w:t>
+            </w:r>
+          </w:p>
+        </w:tc>
+        <w:tc>
+          <w:tcPr>
+            <w:tcW w:type="dxa" w:w="1545"/>
+            <w:tcMar>
+              <w:top w:type="dxa" w:w="60"/>
+              <w:left w:type="dxa" w:w="100"/>
+              <w:bottom w:type="dxa" w:w="60"/>
+              <w:right w:type="dxa" w:w="100"/>
+            </w:tcMar>
+          </w:tcPr>
+          <w:p>
+            <w:pPr>
+              <w:spacing w:after="0"/>
+              <w:jc w:val="right"/>
+            </w:pPr>
+            <w:r>
+              <w:rPr>
+                <w:rFonts w:ascii="Calibri" w:cs="Calibri" w:eastAsia="Calibri" w:hAnsi="Calibri"/>
+                <w:sz w:val="18"/>
+                <w:szCs w:val="18"/>
+              </w:rPr>
+              <w:t xml:space="preserve">−1.21</w:t>
+            </w:r>
+          </w:p>
+        </w:tc>
+        <w:tc>
+          <w:tcPr>
+            <w:tcW w:type="dxa" w:w="1543"/>
+            <w:tcMar>
+              <w:top w:type="dxa" w:w="60"/>
+              <w:left w:type="dxa" w:w="100"/>
+              <w:bottom w:type="dxa" w:w="60"/>
+              <w:right w:type="dxa" w:w="100"/>
+            </w:tcMar>
+          </w:tcPr>
+          <w:p>
+            <w:pPr>
+              <w:spacing w:after="0"/>
+              <w:jc w:val="right"/>
+            </w:pPr>
+            <w:r>
+              <w:rPr>
+                <w:rFonts w:ascii="Calibri" w:cs="Calibri" w:eastAsia="Calibri" w:hAnsi="Calibri"/>
+                <w:sz w:val="18"/>
+                <w:szCs w:val="18"/>
+              </w:rPr>
+              <w:t xml:space="preserve">+1.24%</w:t>
+            </w:r>
+          </w:p>
+        </w:tc>
+      </w:tr>
+      <w:tr>
+        <w:trPr>
+          <w:tblHeader w:val="false"/>
+        </w:trPr>
+        <w:tc>
+          <w:tcPr>
+            <w:tcW w:type="dxa" w:w="3182"/>
+            <w:tcMar>
+              <w:top w:type="dxa" w:w="60"/>
+              <w:left w:type="dxa" w:w="100"/>
+              <w:bottom w:type="dxa" w:w="60"/>
+              <w:right w:type="dxa" w:w="100"/>
+            </w:tcMar>
+          </w:tcPr>
+          <w:p>
+            <w:pPr>
+              <w:spacing w:after="0"/>
+              <w:jc w:val="left"/>
+            </w:pPr>
+            <w:r>
+              <w:rPr>
+                <w:rFonts w:ascii="Calibri" w:cs="Calibri" w:eastAsia="Calibri" w:hAnsi="Calibri"/>
+                <w:sz w:val="18"/>
+                <w:szCs w:val="18"/>
+              </w:rPr>
+              <w:t xml:space="preserve">Salt Lake City</w:t>
+            </w:r>
+          </w:p>
+        </w:tc>
+        <w:tc>
+          <w:tcPr>
+            <w:tcW w:type="dxa" w:w="1545"/>
+            <w:tcMar>
+              <w:top w:type="dxa" w:w="60"/>
+              <w:left w:type="dxa" w:w="100"/>
+              <w:bottom w:type="dxa" w:w="60"/>
+              <w:right w:type="dxa" w:w="100"/>
+            </w:tcMar>
+          </w:tcPr>
+          <w:p>
+            <w:pPr>
+              <w:spacing w:after="0"/>
+              <w:jc w:val="right"/>
+            </w:pPr>
+            <w:r>
+              <w:rPr>
+                <w:rFonts w:ascii="Calibri" w:cs="Calibri" w:eastAsia="Calibri" w:hAnsi="Calibri"/>
+                <w:sz w:val="18"/>
+                <w:szCs w:val="18"/>
+              </w:rPr>
+              <w:t xml:space="preserve">+0.82%</w:t>
+            </w:r>
+          </w:p>
+        </w:tc>
+        <w:tc>
+          <w:tcPr>
+            <w:tcW w:type="dxa" w:w="1545"/>
+            <w:tcMar>
+              <w:top w:type="dxa" w:w="60"/>
+              <w:left w:type="dxa" w:w="100"/>
+              <w:bottom w:type="dxa" w:w="60"/>
+              <w:right w:type="dxa" w:w="100"/>
+            </w:tcMar>
+          </w:tcPr>
+          <w:p>
+            <w:pPr>
+              <w:spacing w:after="0"/>
+              <w:jc w:val="right"/>
+            </w:pPr>
+            <w:r>
+              <w:rPr>
+                <w:rFonts w:ascii="Calibri" w:cs="Calibri" w:eastAsia="Calibri" w:hAnsi="Calibri"/>
+                <w:sz w:val="18"/>
+                <w:szCs w:val="18"/>
+              </w:rPr>
+              <w:t xml:space="preserve">+1.72%</w:t>
+            </w:r>
+          </w:p>
+        </w:tc>
+        <w:tc>
+          <w:tcPr>
+            <w:tcW w:type="dxa" w:w="1545"/>
+            <w:tcMar>
+              <w:top w:type="dxa" w:w="60"/>
+              <w:left w:type="dxa" w:w="100"/>
+              <w:bottom w:type="dxa" w:w="60"/>
+              <w:right w:type="dxa" w:w="100"/>
+            </w:tcMar>
+          </w:tcPr>
+          <w:p>
+            <w:pPr>
+              <w:spacing w:after="0"/>
+              <w:jc w:val="right"/>
+            </w:pPr>
+            <w:r>
+              <w:rPr>
+                <w:rFonts w:ascii="Calibri" w:cs="Calibri" w:eastAsia="Calibri" w:hAnsi="Calibri"/>
+                <w:sz w:val="18"/>
+                <w:szCs w:val="18"/>
+              </w:rPr>
+              <w:t xml:space="preserve">−0.90</w:t>
+            </w:r>
+          </w:p>
+        </w:tc>
+        <w:tc>
+          <w:tcPr>
+            <w:tcW w:type="dxa" w:w="1543"/>
+            <w:tcMar>
+              <w:top w:type="dxa" w:w="60"/>
+              <w:left w:type="dxa" w:w="100"/>
+              <w:bottom w:type="dxa" w:w="60"/>
+              <w:right w:type="dxa" w:w="100"/>
+            </w:tcMar>
+          </w:tcPr>
+          <w:p>
+            <w:pPr>
+              <w:spacing w:after="0"/>
+              <w:jc w:val="right"/>
+            </w:pPr>
+            <w:r>
+              <w:rPr>
+                <w:rFonts w:ascii="Calibri" w:cs="Calibri" w:eastAsia="Calibri" w:hAnsi="Calibri"/>
+                <w:sz w:val="18"/>
+                <w:szCs w:val="18"/>
+              </w:rPr>
+              <w:t xml:space="preserve">+2.09%</w:t>
+            </w:r>
+          </w:p>
+        </w:tc>
+      </w:tr>
+      <w:tr>
+        <w:trPr>
+          <w:tblHeader w:val="false"/>
+        </w:trPr>
+        <w:tc>
+          <w:tcPr>
+            <w:tcW w:type="dxa" w:w="3182"/>
+            <w:tcMar>
+              <w:top w:type="dxa" w:w="60"/>
+              <w:left w:type="dxa" w:w="100"/>
+              <w:bottom w:type="dxa" w:w="60"/>
+              <w:right w:type="dxa" w:w="100"/>
+            </w:tcMar>
+          </w:tcPr>
+          <w:p>
+            <w:pPr>
+              <w:spacing w:after="0"/>
+              <w:jc w:val="left"/>
+            </w:pPr>
+            <w:r>
+              <w:rPr>
+                <w:rFonts w:ascii="Calibri" w:cs="Calibri" w:eastAsia="Calibri" w:hAnsi="Calibri"/>
+                <w:sz w:val="18"/>
+                <w:szCs w:val="18"/>
+              </w:rPr>
+              <w:t xml:space="preserve">Baton Rouge</w:t>
+            </w:r>
+          </w:p>
+        </w:tc>
+        <w:tc>
+          <w:tcPr>
+            <w:tcW w:type="dxa" w:w="1545"/>
+            <w:tcMar>
+              <w:top w:type="dxa" w:w="60"/>
+              <w:left w:type="dxa" w:w="100"/>
+              <w:bottom w:type="dxa" w:w="60"/>
+              <w:right w:type="dxa" w:w="100"/>
+            </w:tcMar>
+          </w:tcPr>
+          <w:p>
+            <w:pPr>
+              <w:spacing w:after="0"/>
+              <w:jc w:val="right"/>
+            </w:pPr>
+            <w:r>
+              <w:rPr>
+                <w:rFonts w:ascii="Calibri" w:cs="Calibri" w:eastAsia="Calibri" w:hAnsi="Calibri"/>
+                <w:sz w:val="18"/>
+                <w:szCs w:val="18"/>
+              </w:rPr>
+              <w:t xml:space="preserve">−0.79%</w:t>
+            </w:r>
+          </w:p>
+        </w:tc>
+        <w:tc>
+          <w:tcPr>
+            <w:tcW w:type="dxa" w:w="1545"/>
+            <w:tcMar>
+              <w:top w:type="dxa" w:w="60"/>
+              <w:left w:type="dxa" w:w="100"/>
+              <w:bottom w:type="dxa" w:w="60"/>
+              <w:right w:type="dxa" w:w="100"/>
+            </w:tcMar>
+          </w:tcPr>
+          <w:p>
+            <w:pPr>
+              <w:spacing w:after="0"/>
+              <w:jc w:val="right"/>
+            </w:pPr>
+            <w:r>
+              <w:rPr>
+                <w:rFonts w:ascii="Calibri" w:cs="Calibri" w:eastAsia="Calibri" w:hAnsi="Calibri"/>
+                <w:sz w:val="18"/>
+                <w:szCs w:val="18"/>
+              </w:rPr>
+              <w:t xml:space="preserve">+0.06%</w:t>
+            </w:r>
+          </w:p>
+        </w:tc>
+        <w:tc>
+          <w:tcPr>
+            <w:tcW w:type="dxa" w:w="1545"/>
+            <w:tcMar>
+              <w:top w:type="dxa" w:w="60"/>
+              <w:left w:type="dxa" w:w="100"/>
+              <w:bottom w:type="dxa" w:w="60"/>
+              <w:right w:type="dxa" w:w="100"/>
+            </w:tcMar>
+          </w:tcPr>
+          <w:p>
+            <w:pPr>
+              <w:spacing w:after="0"/>
+              <w:jc w:val="right"/>
+            </w:pPr>
+            <w:r>
+              <w:rPr>
+                <w:rFonts w:ascii="Calibri" w:cs="Calibri" w:eastAsia="Calibri" w:hAnsi="Calibri"/>
+                <w:sz w:val="18"/>
+                <w:szCs w:val="18"/>
+              </w:rPr>
+              <w:t xml:space="preserve">−0.85</w:t>
+            </w:r>
+          </w:p>
+        </w:tc>
+        <w:tc>
+          <w:tcPr>
+            <w:tcW w:type="dxa" w:w="1543"/>
+            <w:tcMar>
+              <w:top w:type="dxa" w:w="60"/>
+              <w:left w:type="dxa" w:w="100"/>
+              <w:bottom w:type="dxa" w:w="60"/>
+              <w:right w:type="dxa" w:w="100"/>
+            </w:tcMar>
+          </w:tcPr>
+          <w:p>
+            <w:pPr>
+              <w:spacing w:after="0"/>
+              <w:jc w:val="right"/>
+            </w:pPr>
+            <w:r>
+              <w:rPr>
+                <w:rFonts w:ascii="Calibri" w:cs="Calibri" w:eastAsia="Calibri" w:hAnsi="Calibri"/>
+                <w:sz w:val="18"/>
+                <w:szCs w:val="18"/>
+              </w:rPr>
+              <w:t xml:space="preserve">+1.85%</w:t>
+            </w:r>
+          </w:p>
+        </w:tc>
+      </w:tr>
+      <w:tr>
+        <w:trPr>
+          <w:tblHeader w:val="false"/>
+        </w:trPr>
+        <w:tc>
+          <w:tcPr>
+            <w:tcW w:type="dxa" w:w="3182"/>
+            <w:tcMar>
+              <w:top w:type="dxa" w:w="60"/>
+              <w:left w:type="dxa" w:w="100"/>
+              <w:bottom w:type="dxa" w:w="60"/>
+              <w:right w:type="dxa" w:w="100"/>
+            </w:tcMar>
+          </w:tcPr>
+          <w:p>
+            <w:pPr>
+              <w:spacing w:after="0"/>
+              <w:jc w:val="left"/>
+            </w:pPr>
+            <w:r>
+              <w:rPr>
+                <w:rFonts w:ascii="Calibri" w:cs="Calibri" w:eastAsia="Calibri" w:hAnsi="Calibri"/>
+                <w:sz w:val="18"/>
+                <w:szCs w:val="18"/>
+              </w:rPr>
+              <w:t xml:space="preserve">Las Vegas</w:t>
+            </w:r>
+          </w:p>
+        </w:tc>
+        <w:tc>
+          <w:tcPr>
+            <w:tcW w:type="dxa" w:w="1545"/>
+            <w:tcMar>
+              <w:top w:type="dxa" w:w="60"/>
+              <w:left w:type="dxa" w:w="100"/>
+              <w:bottom w:type="dxa" w:w="60"/>
+              <w:right w:type="dxa" w:w="100"/>
+            </w:tcMar>
+          </w:tcPr>
+          <w:p>
+            <w:pPr>
+              <w:spacing w:after="0"/>
+              <w:jc w:val="right"/>
+            </w:pPr>
+            <w:r>
+              <w:rPr>
+                <w:rFonts w:ascii="Calibri" w:cs="Calibri" w:eastAsia="Calibri" w:hAnsi="Calibri"/>
+                <w:sz w:val="18"/>
+                <w:szCs w:val="18"/>
+              </w:rPr>
+              <w:t xml:space="preserve">+1.14%</w:t>
+            </w:r>
+          </w:p>
+        </w:tc>
+        <w:tc>
+          <w:tcPr>
+            <w:tcW w:type="dxa" w:w="1545"/>
+            <w:tcMar>
+              <w:top w:type="dxa" w:w="60"/>
+              <w:left w:type="dxa" w:w="100"/>
+              <w:bottom w:type="dxa" w:w="60"/>
+              <w:right w:type="dxa" w:w="100"/>
+            </w:tcMar>
+          </w:tcPr>
+          <w:p>
+            <w:pPr>
+              <w:spacing w:after="0"/>
+              <w:jc w:val="right"/>
+            </w:pPr>
+            <w:r>
+              <w:rPr>
+                <w:rFonts w:ascii="Calibri" w:cs="Calibri" w:eastAsia="Calibri" w:hAnsi="Calibri"/>
+                <w:sz w:val="18"/>
+                <w:szCs w:val="18"/>
+              </w:rPr>
+              <w:t xml:space="preserve">+1.93%</w:t>
+            </w:r>
+          </w:p>
+        </w:tc>
+        <w:tc>
+          <w:tcPr>
+            <w:tcW w:type="dxa" w:w="1545"/>
+            <w:tcMar>
+              <w:top w:type="dxa" w:w="60"/>
+              <w:left w:type="dxa" w:w="100"/>
+              <w:bottom w:type="dxa" w:w="60"/>
+              <w:right w:type="dxa" w:w="100"/>
+            </w:tcMar>
+          </w:tcPr>
+          <w:p>
+            <w:pPr>
+              <w:spacing w:after="0"/>
+              <w:jc w:val="right"/>
+            </w:pPr>
+            <w:r>
+              <w:rPr>
+                <w:rFonts w:ascii="Calibri" w:cs="Calibri" w:eastAsia="Calibri" w:hAnsi="Calibri"/>
+                <w:sz w:val="18"/>
+                <w:szCs w:val="18"/>
+              </w:rPr>
+              <w:t xml:space="preserve">−0.79</w:t>
+            </w:r>
+          </w:p>
+        </w:tc>
+        <w:tc>
+          <w:tcPr>
+            <w:tcW w:type="dxa" w:w="1543"/>
+            <w:tcMar>
+              <w:top w:type="dxa" w:w="60"/>
+              <w:left w:type="dxa" w:w="100"/>
+              <w:bottom w:type="dxa" w:w="60"/>
+              <w:right w:type="dxa" w:w="100"/>
+            </w:tcMar>
+          </w:tcPr>
+          <w:p>
+            <w:pPr>
+              <w:spacing w:after="0"/>
+              <w:jc w:val="right"/>
+            </w:pPr>
+            <w:r>
+              <w:rPr>
+                <w:rFonts w:ascii="Calibri" w:cs="Calibri" w:eastAsia="Calibri" w:hAnsi="Calibri"/>
+                <w:sz w:val="18"/>
+                <w:szCs w:val="18"/>
+              </w:rPr>
+              <w:t xml:space="preserve">+2.26%</w:t>
+            </w:r>
+          </w:p>
+        </w:tc>
+      </w:tr>
+      <w:tr>
+        <w:trPr>
+          <w:tblHeader w:val="false"/>
+        </w:trPr>
+        <w:tc>
+          <w:tcPr>
+            <w:tcW w:type="dxa" w:w="3182"/>
+            <w:tcMar>
+              <w:top w:type="dxa" w:w="60"/>
+              <w:left w:type="dxa" w:w="100"/>
+              <w:bottom w:type="dxa" w:w="60"/>
+              <w:right w:type="dxa" w:w="100"/>
+            </w:tcMar>
+          </w:tcPr>
+          <w:p>
+            <w:pPr>
+              <w:spacing w:after="0"/>
+              <w:jc w:val="left"/>
+            </w:pPr>
+            <w:r>
+              <w:rPr>
+                <w:rFonts w:ascii="Calibri" w:cs="Calibri" w:eastAsia="Calibri" w:hAnsi="Calibri"/>
+                <w:sz w:val="18"/>
+                <w:szCs w:val="18"/>
+              </w:rPr>
+              <w:t xml:space="preserve">Reno</w:t>
+            </w:r>
+          </w:p>
+        </w:tc>
+        <w:tc>
+          <w:tcPr>
+            <w:tcW w:type="dxa" w:w="1545"/>
+            <w:tcMar>
+              <w:top w:type="dxa" w:w="60"/>
+              <w:left w:type="dxa" w:w="100"/>
+              <w:bottom w:type="dxa" w:w="60"/>
+              <w:right w:type="dxa" w:w="100"/>
+            </w:tcMar>
+          </w:tcPr>
+          <w:p>
+            <w:pPr>
+              <w:spacing w:after="0"/>
+              <w:jc w:val="right"/>
+            </w:pPr>
+            <w:r>
+              <w:rPr>
+                <w:rFonts w:ascii="Calibri" w:cs="Calibri" w:eastAsia="Calibri" w:hAnsi="Calibri"/>
+                <w:sz w:val="18"/>
+                <w:szCs w:val="18"/>
+              </w:rPr>
+              <w:t xml:space="preserve">+1.64%</w:t>
+            </w:r>
+          </w:p>
+        </w:tc>
+        <w:tc>
+          <w:tcPr>
+            <w:tcW w:type="dxa" w:w="1545"/>
+            <w:tcMar>
+              <w:top w:type="dxa" w:w="60"/>
+              <w:left w:type="dxa" w:w="100"/>
+              <w:bottom w:type="dxa" w:w="60"/>
+              <w:right w:type="dxa" w:w="100"/>
+            </w:tcMar>
+          </w:tcPr>
+          <w:p>
+            <w:pPr>
+              <w:spacing w:after="0"/>
+              <w:jc w:val="right"/>
+            </w:pPr>
+            <w:r>
+              <w:rPr>
+                <w:rFonts w:ascii="Calibri" w:cs="Calibri" w:eastAsia="Calibri" w:hAnsi="Calibri"/>
+                <w:sz w:val="18"/>
+                <w:szCs w:val="18"/>
+              </w:rPr>
+              <w:t xml:space="preserve">+2.15%</w:t>
+            </w:r>
+          </w:p>
+        </w:tc>
+        <w:tc>
+          <w:tcPr>
+            <w:tcW w:type="dxa" w:w="1545"/>
+            <w:tcMar>
+              <w:top w:type="dxa" w:w="60"/>
+              <w:left w:type="dxa" w:w="100"/>
+              <w:bottom w:type="dxa" w:w="60"/>
+              <w:right w:type="dxa" w:w="100"/>
+            </w:tcMar>
+          </w:tcPr>
+          <w:p>
+            <w:pPr>
+              <w:spacing w:after="0"/>
+              <w:jc w:val="right"/>
+            </w:pPr>
+            <w:r>
+              <w:rPr>
+                <w:rFonts w:ascii="Calibri" w:cs="Calibri" w:eastAsia="Calibri" w:hAnsi="Calibri"/>
+                <w:sz w:val="18"/>
+                <w:szCs w:val="18"/>
+              </w:rPr>
+              <w:t xml:space="preserve">−0.50</w:t>
+            </w:r>
+          </w:p>
+        </w:tc>
+        <w:tc>
+          <w:tcPr>
+            <w:tcW w:type="dxa" w:w="1543"/>
+            <w:tcMar>
+              <w:top w:type="dxa" w:w="60"/>
+              <w:left w:type="dxa" w:w="100"/>
+              <w:bottom w:type="dxa" w:w="60"/>
+              <w:right w:type="dxa" w:w="100"/>
+            </w:tcMar>
+          </w:tcPr>
+          <w:p>
+            <w:pPr>
+              <w:spacing w:after="0"/>
+              <w:jc w:val="right"/>
+            </w:pPr>
+            <w:r>
+              <w:rPr>
+                <w:rFonts w:ascii="Calibri" w:cs="Calibri" w:eastAsia="Calibri" w:hAnsi="Calibri"/>
+                <w:sz w:val="18"/>
+                <w:szCs w:val="18"/>
+              </w:rPr>
+              <w:t xml:space="preserve">+1.63%</w:t>
+            </w:r>
+          </w:p>
+        </w:tc>
+      </w:tr>
+      <w:tr>
+        <w:trPr>
+          <w:tblHeader w:val="false"/>
+        </w:trPr>
+        <w:tc>
+          <w:tcPr>
+            <w:tcW w:type="dxa" w:w="3182"/>
+            <w:tcMar>
+              <w:top w:type="dxa" w:w="60"/>
+              <w:left w:type="dxa" w:w="100"/>
+              <w:bottom w:type="dxa" w:w="60"/>
+              <w:right w:type="dxa" w:w="100"/>
+            </w:tcMar>
+          </w:tcPr>
+          <w:p>
+            <w:pPr>
+              <w:spacing w:after="0"/>
+              <w:jc w:val="left"/>
+            </w:pPr>
+            <w:r>
+              <w:rPr>
+                <w:rFonts w:ascii="Calibri" w:cs="Calibri" w:eastAsia="Calibri" w:hAnsi="Calibri"/>
+                <w:sz w:val="18"/>
+                <w:szCs w:val="18"/>
+              </w:rPr>
+              <w:t xml:space="preserve">Dallas–Fort Worth</w:t>
+            </w:r>
+          </w:p>
+        </w:tc>
+        <w:tc>
+          <w:tcPr>
+            <w:tcW w:type="dxa" w:w="1545"/>
+            <w:tcMar>
+              <w:top w:type="dxa" w:w="60"/>
+              <w:left w:type="dxa" w:w="100"/>
+              <w:bottom w:type="dxa" w:w="60"/>
+              <w:right w:type="dxa" w:w="100"/>
+            </w:tcMar>
+          </w:tcPr>
+          <w:p>
+            <w:pPr>
+              <w:spacing w:after="0"/>
+              <w:jc w:val="right"/>
+            </w:pPr>
+            <w:r>
+              <w:rPr>
+                <w:rFonts w:ascii="Calibri" w:cs="Calibri" w:eastAsia="Calibri" w:hAnsi="Calibri"/>
+                <w:sz w:val="18"/>
+                <w:szCs w:val="18"/>
+              </w:rPr>
+              <w:t xml:space="preserve">+0.59%</w:t>
+            </w:r>
+          </w:p>
+        </w:tc>
+        <w:tc>
+          <w:tcPr>
+            <w:tcW w:type="dxa" w:w="1545"/>
+            <w:tcMar>
+              <w:top w:type="dxa" w:w="60"/>
+              <w:left w:type="dxa" w:w="100"/>
+              <w:bottom w:type="dxa" w:w="60"/>
+              <w:right w:type="dxa" w:w="100"/>
+            </w:tcMar>
+          </w:tcPr>
+          <w:p>
+            <w:pPr>
+              <w:spacing w:after="0"/>
+              <w:jc w:val="right"/>
+            </w:pPr>
+            <w:r>
+              <w:rPr>
+                <w:rFonts w:ascii="Calibri" w:cs="Calibri" w:eastAsia="Calibri" w:hAnsi="Calibri"/>
+                <w:sz w:val="18"/>
+                <w:szCs w:val="18"/>
+              </w:rPr>
+              <w:t xml:space="preserve">+0.80%</w:t>
+            </w:r>
+          </w:p>
+        </w:tc>
+        <w:tc>
+          <w:tcPr>
+            <w:tcW w:type="dxa" w:w="1545"/>
+            <w:tcMar>
+              <w:top w:type="dxa" w:w="60"/>
+              <w:left w:type="dxa" w:w="100"/>
+              <w:bottom w:type="dxa" w:w="60"/>
+              <w:right w:type="dxa" w:w="100"/>
+            </w:tcMar>
+          </w:tcPr>
+          <w:p>
+            <w:pPr>
+              <w:spacing w:after="0"/>
+              <w:jc w:val="right"/>
+            </w:pPr>
+            <w:r>
+              <w:rPr>
+                <w:rFonts w:ascii="Calibri" w:cs="Calibri" w:eastAsia="Calibri" w:hAnsi="Calibri"/>
+                <w:sz w:val="18"/>
+                <w:szCs w:val="18"/>
+              </w:rPr>
+              <w:t xml:space="preserve">−0.21</w:t>
+            </w:r>
+          </w:p>
+        </w:tc>
+        <w:tc>
+          <w:tcPr>
+            <w:tcW w:type="dxa" w:w="1543"/>
+            <w:tcMar>
+              <w:top w:type="dxa" w:w="60"/>
+              <w:left w:type="dxa" w:w="100"/>
+              <w:bottom w:type="dxa" w:w="60"/>
+              <w:right w:type="dxa" w:w="100"/>
+            </w:tcMar>
+          </w:tcPr>
+          <w:p>
+            <w:pPr>
+              <w:spacing w:after="0"/>
+              <w:jc w:val="right"/>
+            </w:pPr>
+            <w:r>
+              <w:rPr>
+                <w:rFonts w:ascii="Calibri" w:cs="Calibri" w:eastAsia="Calibri" w:hAnsi="Calibri"/>
+                <w:sz w:val="18"/>
+                <w:szCs w:val="18"/>
+              </w:rPr>
+              <w:t xml:space="preserve">+0.84%</w:t>
+            </w:r>
+          </w:p>
+        </w:tc>
+      </w:tr>
+      <w:tr>
+        <w:trPr>
+          <w:tblHeader w:val="false"/>
+        </w:trPr>
+        <w:tc>
+          <w:tcPr>
+            <w:tcW w:type="dxa" w:w="3182"/>
+            <w:tcMar>
+              <w:top w:type="dxa" w:w="60"/>
+              <w:left w:type="dxa" w:w="100"/>
+              <w:bottom w:type="dxa" w:w="60"/>
+              <w:right w:type="dxa" w:w="100"/>
+            </w:tcMar>
+          </w:tcPr>
+          <w:p>
+            <w:pPr>
+              <w:spacing w:after="0"/>
+              <w:jc w:val="left"/>
+            </w:pPr>
+            <w:r>
+              <w:rPr>
+                <w:rFonts w:ascii="Calibri" w:cs="Calibri" w:eastAsia="Calibri" w:hAnsi="Calibri"/>
+                <w:sz w:val="18"/>
+                <w:szCs w:val="18"/>
+              </w:rPr>
+              <w:t xml:space="preserve">Houston</w:t>
+            </w:r>
+          </w:p>
+        </w:tc>
+        <w:tc>
+          <w:tcPr>
+            <w:tcW w:type="dxa" w:w="1545"/>
+            <w:tcMar>
+              <w:top w:type="dxa" w:w="60"/>
+              <w:left w:type="dxa" w:w="100"/>
+              <w:bottom w:type="dxa" w:w="60"/>
+              <w:right w:type="dxa" w:w="100"/>
+            </w:tcMar>
+          </w:tcPr>
+          <w:p>
+            <w:pPr>
+              <w:spacing w:after="0"/>
+              <w:jc w:val="right"/>
+            </w:pPr>
+            <w:r>
+              <w:rPr>
+                <w:rFonts w:ascii="Calibri" w:cs="Calibri" w:eastAsia="Calibri" w:hAnsi="Calibri"/>
+                <w:sz w:val="18"/>
+                <w:szCs w:val="18"/>
+              </w:rPr>
+              <w:t xml:space="preserve">+0.31%</w:t>
+            </w:r>
+          </w:p>
+        </w:tc>
+        <w:tc>
+          <w:tcPr>
+            <w:tcW w:type="dxa" w:w="1545"/>
+            <w:tcMar>
+              <w:top w:type="dxa" w:w="60"/>
+              <w:left w:type="dxa" w:w="100"/>
+              <w:bottom w:type="dxa" w:w="60"/>
+              <w:right w:type="dxa" w:w="100"/>
+            </w:tcMar>
+          </w:tcPr>
+          <w:p>
+            <w:pPr>
+              <w:spacing w:after="0"/>
+              <w:jc w:val="right"/>
+            </w:pPr>
+            <w:r>
+              <w:rPr>
+                <w:rFonts w:ascii="Calibri" w:cs="Calibri" w:eastAsia="Calibri" w:hAnsi="Calibri"/>
+                <w:sz w:val="18"/>
+                <w:szCs w:val="18"/>
+              </w:rPr>
+              <w:t xml:space="preserve">+0.48%</w:t>
+            </w:r>
+          </w:p>
+        </w:tc>
+        <w:tc>
+          <w:tcPr>
+            <w:tcW w:type="dxa" w:w="1545"/>
+            <w:tcMar>
+              <w:top w:type="dxa" w:w="60"/>
+              <w:left w:type="dxa" w:w="100"/>
+              <w:bottom w:type="dxa" w:w="60"/>
+              <w:right w:type="dxa" w:w="100"/>
+            </w:tcMar>
+          </w:tcPr>
+          <w:p>
+            <w:pPr>
+              <w:spacing w:after="0"/>
+              <w:jc w:val="right"/>
+            </w:pPr>
+            <w:r>
+              <w:rPr>
+                <w:rFonts w:ascii="Calibri" w:cs="Calibri" w:eastAsia="Calibri" w:hAnsi="Calibri"/>
+                <w:sz w:val="18"/>
+                <w:szCs w:val="18"/>
+              </w:rPr>
+              <w:t xml:space="preserve">−0.17</w:t>
+            </w:r>
+          </w:p>
+        </w:tc>
+        <w:tc>
+          <w:tcPr>
+            <w:tcW w:type="dxa" w:w="1543"/>
+            <w:tcMar>
+              <w:top w:type="dxa" w:w="60"/>
+              <w:left w:type="dxa" w:w="100"/>
+              <w:bottom w:type="dxa" w:w="60"/>
+              <w:right w:type="dxa" w:w="100"/>
+            </w:tcMar>
+          </w:tcPr>
+          <w:p>
+            <w:pPr>
+              <w:spacing w:after="0"/>
+              <w:jc w:val="right"/>
+            </w:pPr>
+            <w:r>
+              <w:rPr>
+                <w:rFonts w:ascii="Calibri" w:cs="Calibri" w:eastAsia="Calibri" w:hAnsi="Calibri"/>
+                <w:sz w:val="18"/>
+                <w:szCs w:val="18"/>
+              </w:rPr>
+              <w:t xml:space="preserve">+0.66%</w:t>
+            </w:r>
+          </w:p>
+        </w:tc>
+      </w:tr>
+      <w:tr>
+        <w:trPr>
+          <w:tblHeader w:val="false"/>
+        </w:trPr>
+        <w:tc>
+          <w:tcPr>
+            <w:tcW w:type="dxa" w:w="3182"/>
+            <w:tcMar>
+              <w:top w:type="dxa" w:w="60"/>
+              <w:left w:type="dxa" w:w="100"/>
+              <w:bottom w:type="dxa" w:w="60"/>
+              <w:right w:type="dxa" w:w="100"/>
+            </w:tcMar>
+          </w:tcPr>
+          <w:p>
+            <w:pPr>
+              <w:spacing w:after="0"/>
+              <w:jc w:val="left"/>
+            </w:pPr>
+            <w:r>
+              <w:rPr>
+                <w:rFonts w:ascii="Calibri" w:cs="Calibri" w:eastAsia="Calibri" w:hAnsi="Calibri"/>
+                <w:sz w:val="18"/>
+                <w:szCs w:val="18"/>
+              </w:rPr>
+              <w:t xml:space="preserve">Phoenix</w:t>
+            </w:r>
+          </w:p>
+        </w:tc>
+        <w:tc>
+          <w:tcPr>
+            <w:tcW w:type="dxa" w:w="1545"/>
+            <w:tcMar>
+              <w:top w:type="dxa" w:w="60"/>
+              <w:left w:type="dxa" w:w="100"/>
+              <w:bottom w:type="dxa" w:w="60"/>
+              <w:right w:type="dxa" w:w="100"/>
+            </w:tcMar>
+          </w:tcPr>
+          <w:p>
+            <w:pPr>
+              <w:spacing w:after="0"/>
+              <w:jc w:val="right"/>
+            </w:pPr>
+            <w:r>
+              <w:rPr>
+                <w:rFonts w:ascii="Calibri" w:cs="Calibri" w:eastAsia="Calibri" w:hAnsi="Calibri"/>
+                <w:sz w:val="18"/>
+                <w:szCs w:val="18"/>
+              </w:rPr>
+              <w:t xml:space="preserve">−0.03%</w:t>
+            </w:r>
+          </w:p>
+        </w:tc>
+        <w:tc>
+          <w:tcPr>
+            <w:tcW w:type="dxa" w:w="1545"/>
+            <w:tcMar>
+              <w:top w:type="dxa" w:w="60"/>
+              <w:left w:type="dxa" w:w="100"/>
+              <w:bottom w:type="dxa" w:w="60"/>
+              <w:right w:type="dxa" w:w="100"/>
+            </w:tcMar>
+          </w:tcPr>
+          <w:p>
+            <w:pPr>
+              <w:spacing w:after="0"/>
+              <w:jc w:val="right"/>
+            </w:pPr>
+            <w:r>
+              <w:rPr>
+                <w:rFonts w:ascii="Calibri" w:cs="Calibri" w:eastAsia="Calibri" w:hAnsi="Calibri"/>
+                <w:sz w:val="18"/>
+                <w:szCs w:val="18"/>
+              </w:rPr>
+              <w:t xml:space="preserve">+0.08%</w:t>
+            </w:r>
+          </w:p>
+        </w:tc>
+        <w:tc>
+          <w:tcPr>
+            <w:tcW w:type="dxa" w:w="1545"/>
+            <w:tcMar>
+              <w:top w:type="dxa" w:w="60"/>
+              <w:left w:type="dxa" w:w="100"/>
+              <w:bottom w:type="dxa" w:w="60"/>
+              <w:right w:type="dxa" w:w="100"/>
+            </w:tcMar>
+          </w:tcPr>
+          <w:p>
+            <w:pPr>
+              <w:spacing w:after="0"/>
+              <w:jc w:val="right"/>
+            </w:pPr>
+            <w:r>
+              <w:rPr>
+                <w:rFonts w:ascii="Calibri" w:cs="Calibri" w:eastAsia="Calibri" w:hAnsi="Calibri"/>
+                <w:sz w:val="18"/>
+                <w:szCs w:val="18"/>
+              </w:rPr>
+              <w:t xml:space="preserve">−0.11</w:t>
+            </w:r>
+          </w:p>
+        </w:tc>
+        <w:tc>
+          <w:tcPr>
+            <w:tcW w:type="dxa" w:w="1543"/>
+            <w:tcMar>
+              <w:top w:type="dxa" w:w="60"/>
+              <w:left w:type="dxa" w:w="100"/>
+              <w:bottom w:type="dxa" w:w="60"/>
+              <w:right w:type="dxa" w:w="100"/>
+            </w:tcMar>
+          </w:tcPr>
+          <w:p>
+            <w:pPr>
+              <w:spacing w:after="0"/>
+              <w:jc w:val="right"/>
+            </w:pPr>
+            <w:r>
+              <w:rPr>
+                <w:rFonts w:ascii="Calibri" w:cs="Calibri" w:eastAsia="Calibri" w:hAnsi="Calibri"/>
+                <w:sz w:val="18"/>
+                <w:szCs w:val="18"/>
+              </w:rPr>
+              <w:t xml:space="preserve">+0.93%</w:t>
+            </w:r>
+          </w:p>
+        </w:tc>
+      </w:tr>
+      <w:tr>
+        <w:trPr>
+          <w:tblHeader w:val="false"/>
+        </w:trPr>
+        <w:tc>
+          <w:tcPr>
+            <w:tcW w:type="dxa" w:w="3182"/>
+            <w:tcMar>
+              <w:top w:type="dxa" w:w="60"/>
+              <w:left w:type="dxa" w:w="100"/>
+              <w:bottom w:type="dxa" w:w="60"/>
+              <w:right w:type="dxa" w:w="100"/>
+            </w:tcMar>
+          </w:tcPr>
+          <w:p>
+            <w:pPr>
+              <w:spacing w:after="0"/>
+              <w:jc w:val="left"/>
+            </w:pPr>
+            <w:r>
+              <w:rPr>
+                <w:rFonts w:ascii="Calibri" w:cs="Calibri" w:eastAsia="Calibri" w:hAnsi="Calibri"/>
+                <w:sz w:val="18"/>
+                <w:szCs w:val="18"/>
+              </w:rPr>
+              <w:t xml:space="preserve">Denver</w:t>
+            </w:r>
+          </w:p>
+        </w:tc>
+        <w:tc>
+          <w:tcPr>
+            <w:tcW w:type="dxa" w:w="1545"/>
+            <w:tcMar>
+              <w:top w:type="dxa" w:w="60"/>
+              <w:left w:type="dxa" w:w="100"/>
+              <w:bottom w:type="dxa" w:w="60"/>
+              <w:right w:type="dxa" w:w="100"/>
+            </w:tcMar>
+          </w:tcPr>
+          <w:p>
+            <w:pPr>
+              <w:spacing w:after="0"/>
+              <w:jc w:val="right"/>
+            </w:pPr>
+            <w:r>
+              <w:rPr>
+                <w:rFonts w:ascii="Calibri" w:cs="Calibri" w:eastAsia="Calibri" w:hAnsi="Calibri"/>
+                <w:sz w:val="18"/>
+                <w:szCs w:val="18"/>
+              </w:rPr>
+              <w:t xml:space="preserve">−0.11%</w:t>
+            </w:r>
+          </w:p>
+        </w:tc>
+        <w:tc>
+          <w:tcPr>
+            <w:tcW w:type="dxa" w:w="1545"/>
+            <w:tcMar>
+              <w:top w:type="dxa" w:w="60"/>
+              <w:left w:type="dxa" w:w="100"/>
+              <w:bottom w:type="dxa" w:w="60"/>
+              <w:right w:type="dxa" w:w="100"/>
+            </w:tcMar>
+          </w:tcPr>
+          <w:p>
+            <w:pPr>
+              <w:spacing w:after="0"/>
+              <w:jc w:val="right"/>
+            </w:pPr>
+            <w:r>
+              <w:rPr>
+                <w:rFonts w:ascii="Calibri" w:cs="Calibri" w:eastAsia="Calibri" w:hAnsi="Calibri"/>
+                <w:sz w:val="18"/>
+                <w:szCs w:val="18"/>
+              </w:rPr>
+              <w:t xml:space="preserve">−0.37%</w:t>
+            </w:r>
+          </w:p>
+        </w:tc>
+        <w:tc>
+          <w:tcPr>
+            <w:tcW w:type="dxa" w:w="1545"/>
+            <w:tcMar>
+              <w:top w:type="dxa" w:w="60"/>
+              <w:left w:type="dxa" w:w="100"/>
+              <w:bottom w:type="dxa" w:w="60"/>
+              <w:right w:type="dxa" w:w="100"/>
+            </w:tcMar>
+          </w:tcPr>
+          <w:p>
+            <w:pPr>
+              <w:spacing w:after="0"/>
+              <w:jc w:val="right"/>
+            </w:pPr>
+            <w:r>
+              <w:rPr>
+                <w:rFonts w:ascii="Calibri" w:cs="Calibri" w:eastAsia="Calibri" w:hAnsi="Calibri"/>
+                <w:sz w:val="18"/>
+                <w:szCs w:val="18"/>
+              </w:rPr>
+              <w:t xml:space="preserve">+0.26</w:t>
+            </w:r>
+          </w:p>
+        </w:tc>
+        <w:tc>
+          <w:tcPr>
+            <w:tcW w:type="dxa" w:w="1543"/>
+            <w:tcMar>
+              <w:top w:type="dxa" w:w="60"/>
+              <w:left w:type="dxa" w:w="100"/>
+              <w:bottom w:type="dxa" w:w="60"/>
+              <w:right w:type="dxa" w:w="100"/>
+            </w:tcMar>
+          </w:tcPr>
+          <w:p>
+            <w:pPr>
+              <w:spacing w:after="0"/>
+              <w:jc w:val="right"/>
+            </w:pPr>
+            <w:r>
+              <w:rPr>
+                <w:rFonts w:ascii="Calibri" w:cs="Calibri" w:eastAsia="Calibri" w:hAnsi="Calibri"/>
+                <w:sz w:val="18"/>
+                <w:szCs w:val="18"/>
+              </w:rPr>
+              <w:t xml:space="preserve">−0.09%</w:t>
+            </w:r>
+          </w:p>
+        </w:tc>
+      </w:tr>
+    </w:tbl>
+    <w:p>
+      <w:pPr>
+        <w:spacing w:after="80"/>
+      </w:pPr>
+    </w:p>
+    <w:p>
+      <w:pPr>
+        <w:spacing w:after="120" w:line="276"/>
+        <w:jc w:val="both"/>
+      </w:pPr>
+      <w:r>
+        <w:rPr>
+          <w:rFonts w:ascii="Calibri" w:cs="Calibri" w:eastAsia="Calibri" w:hAnsi="Calibri"/>
+          <w:sz w:val="21"/>
+          <w:szCs w:val="21"/>
+        </w:rPr>
+        <w:t xml:space="preserve">Three conclusions. </w:t>
+      </w:r>
+      <w:r>
+        <w:rPr>
+          <w:rFonts w:ascii="Calibri" w:cs="Calibri" w:eastAsia="Calibri" w:hAnsi="Calibri"/>
+          <w:b/>
+          <w:bCs/>
+          <w:sz w:val="21"/>
+          <w:szCs w:val="21"/>
+        </w:rPr>
+        <w:t xml:space="preserve">First</w:t>
+      </w:r>
+      <w:r>
+        <w:rPr>
+          <w:rFonts w:ascii="Calibri" w:cs="Calibri" w:eastAsia="Calibri" w:hAnsi="Calibri"/>
+          <w:sz w:val="21"/>
+          <w:szCs w:val="21"/>
+        </w:rPr>
+        <w:t xml:space="preserve">, the Q4 2025 understatement is systematic: the survey printed below the tax records in nine of ten metros in the shutdown quarter, after agreeing within ±0.3pp in seven of ten the quarter before. </w:t>
+      </w:r>
+      <w:r>
+        <w:rPr>
+          <w:rFonts w:ascii="Calibri" w:cs="Calibri" w:eastAsia="Calibri" w:hAnsi="Calibri"/>
+          <w:b/>
+          <w:bCs/>
+          <w:sz w:val="21"/>
+          <w:szCs w:val="21"/>
+        </w:rPr>
+        <w:t xml:space="preserve">Second</w:t>
+      </w:r>
+      <w:r>
+        <w:rPr>
+          <w:rFonts w:ascii="Calibri" w:cs="Calibri" w:eastAsia="Calibri" w:hAnsi="Calibri"/>
+          <w:sz w:val="21"/>
+          <w:szCs w:val="21"/>
+        </w:rPr>
+        <w:t xml:space="preserve">, the gap scales with actual growth — fast-formation metros (Boise, Austin, SLC, Vegas, Reno) show gaps of −0.5 to −1.4pp while flat metros (Phoenix, Denver, Houston) show none — the birth-death fingerprint: the model's error is proportional to how far actual business formation deviates from its modeled baseline. Boise, the smallest fast-growth metro in the set, is the extreme case, not an outlier in kind. </w:t>
+      </w:r>
+      <w:r>
+        <w:rPr>
+          <w:rFonts w:ascii="Calibri" w:cs="Calibri" w:eastAsia="Calibri" w:hAnsi="Calibri"/>
+          <w:b/>
+          <w:bCs/>
+          <w:sz w:val="21"/>
+          <w:szCs w:val="21"/>
+        </w:rPr>
+        <w:t xml:space="preserve">Third</w:t>
+      </w:r>
+      <w:r>
+        <w:rPr>
+          <w:rFonts w:ascii="Calibri" w:cs="Calibri" w:eastAsia="Calibri" w:hAnsi="Calibri"/>
+          <w:sz w:val="21"/>
+          <w:szCs w:val="21"/>
+        </w:rPr>
+        <w:t xml:space="preserve">, the honest wrinkle: several peers' CES prints recovered sharply by mid-2026 (Vegas +2.26%, SLC +2.09%) while Boise's has not — consistent with a small panel re-anchoring slowly (implying true Boise growth near +1.8%), but not provable until the Q1 2026 QCEW publishes in September 2026, which remains the diligence checkpoint.</w:t>
+      </w:r>
+    </w:p>
+    <w:p>
+      <w:pPr>
+        <w:pStyle w:val="Heading1"/>
+        <w:pageBreakBefore/>
+        <w:spacing w:after="160" w:before="240"/>
+      </w:pPr>
+      <w:r>
+        <w:rPr>
+          <w:rFonts w:ascii="Georgia" w:cs="Georgia" w:eastAsia="Georgia" w:hAnsi="Georgia"/>
+          <w:b/>
+          <w:bCs/>
+          <w:color w:val="1D231F"/>
+          <w:sz w:val="32"/>
+          <w:szCs w:val="32"/>
+        </w:rPr>
+        <w:t xml:space="preserve">Appendix V: Source Base</w:t>
       </w:r>
     </w:p>
     <w:p>

</xml_diff>

<commit_message>
Incorporate Placer.ai device-based migration data (appendix K + paper appendix V)
- YE Jun 2026 net domestic migration re-accelerated to a 5-yr high
  (~+11.6K, ~2x prior year); Boise #5 of 925 CBSAs (+1.45% rate);
  Ada County #8 of 3,126 US counties (+8,552)
- CA = 47% of net inflow; DC feeder doubled (federal exodus channel);
  in-migrant HHI parity ~1.00x
- Subject's ZIP 83642 is the metro's #1 in-migration ZIP (+2,417,
  accelerating) while N Meridian decelerated — flow rotating to the
  subject's corridor
- Raw exports archived in data/placerai/; memo (v4 note) and location
  memo updated; paper rebuilt with Placer addendum + appendix V;
  new diligence checkpoint: Census Vintage 2026 (Dec 26-Mar 27)

Co-Authored-By: Claude Fable 5 <noreply@anthropic.com>
Claude-Session: https://claude.ai/code/session_018pjKPrYAW2u8zH3WtQwHiV
</commit_message>
<xml_diff>
--- a/employment-drivers/The Boise Slowdown - Research Paper.docx
+++ b/employment-drivers/The Boise Slowdown - Research Paper.docx
@@ -7471,6 +7471,66 @@
           <w:szCs w:val="21"/>
         </w:rPr>
         <w:t xml:space="preserve"> a supply-constrained labor market with top-3 wage growth is materially better for apartment demand than the payroll number implies. Renters' incomes are rising ~4–5%/year; the people not appearing in CES payrolls (retirees, remote workers, the self-employed) still lease apartments; and school-enrollment declines in West Ada — driven by housing costs pricing out young families — are, perversely, a renter-retention signal for the own-vs-rent spread documented in the v2 memo.</w:t>
+      </w:r>
+    </w:p>
+    <w:p>
+      <w:pPr>
+        <w:spacing w:after="120" w:line="276"/>
+        <w:jc w:val="both"/>
+      </w:pPr>
+      <w:r>
+        <w:rPr>
+          <w:rFonts w:ascii="Calibri" w:cs="Calibri" w:eastAsia="Calibri" w:hAnsi="Calibri"/>
+          <w:b/>
+          <w:bCs/>
+          <w:sz w:val="21"/>
+          <w:szCs w:val="21"/>
+        </w:rPr>
+        <w:t xml:space="preserve">Post-publication addendum (Placer.ai device data, ingested Aug 13, 2026 — appendix K):</w:t>
+      </w:r>
+      <w:r>
+        <w:rPr>
+          <w:rFonts w:ascii="Calibri" w:cs="Calibri" w:eastAsia="Calibri" w:hAnsi="Calibri"/>
+          <w:sz w:val="21"/>
+          <w:szCs w:val="21"/>
+        </w:rPr>
+        <w:t xml:space="preserve"> client-provided mobile-device migration data extends the population picture through June 2026, eleven months past the last Census vintage — and it shows net migration </w:t>
+      </w:r>
+      <w:r>
+        <w:rPr>
+          <w:rFonts w:ascii="Calibri" w:cs="Calibri" w:eastAsia="Calibri" w:hAnsi="Calibri"/>
+          <w:i/>
+          <w:iCs/>
+          <w:sz w:val="21"/>
+          <w:szCs w:val="21"/>
+        </w:rPr>
+        <w:t xml:space="preserve">re-accelerating to a five-year high</w:t>
+      </w:r>
+      <w:r>
+        <w:rPr>
+          <w:rFonts w:ascii="Calibri" w:cs="Calibri" w:eastAsia="Calibri" w:hAnsi="Calibri"/>
+          <w:sz w:val="21"/>
+          <w:szCs w:val="21"/>
+        </w:rPr>
+        <w:t xml:space="preserve"> (YE June 2026: ~+11.6–12.4K net domestic, nearly double the prior year; Boise ranks #5 of 925 US CBSAs in absolute net migration and #5 by rate; Ada County ranks #8 of 3,126 US counties; the subject's own ZIP, 83642, is the metro's #1 in-migration ZIP at +2,417 and accelerating). This sharpens the reconciliation above: record population inflow alongside a </w:t>
+      </w:r>
+      <w:r>
+        <w:rPr>
+          <w:rFonts w:ascii="Calibri" w:cs="Calibri" w:eastAsia="Calibri" w:hAnsi="Calibri"/>
+          <w:i/>
+          <w:iCs/>
+          <w:sz w:val="21"/>
+          <w:szCs w:val="21"/>
+        </w:rPr>
+        <w:t xml:space="preserve">measured</w:t>
+      </w:r>
+      <w:r>
+        <w:rPr>
+          <w:rFonts w:ascii="Calibri" w:cs="Calibri" w:eastAsia="Calibri" w:hAnsi="Calibri"/>
+          <w:sz w:val="21"/>
+          <w:szCs w:val="21"/>
+        </w:rPr>
+        <w:t xml:space="preserve"> labor-force contraction is coherent only if the BLS population controls lag reality (the same artifact family as Finding 1) and/or the migrant mix skews toward non-workers — and under either reading, housing demand is running ahead of every payroll statistic in this paper.</w:t>
       </w:r>
     </w:p>
     <w:p>
@@ -11748,7 +11808,553 @@
           <w:sz w:val="32"/>
           <w:szCs w:val="32"/>
         </w:rPr>
-        <w:t xml:space="preserve">Appendix V: Source Base</w:t>
+        <w:t xml:space="preserve">Appendix V: Placer.ai Migration Evidence (added Aug 13, 2026)</w:t>
+      </w:r>
+    </w:p>
+    <w:p>
+      <w:pPr>
+        <w:spacing w:after="120" w:line="276"/>
+        <w:jc w:val="both"/>
+      </w:pPr>
+      <w:r>
+        <w:rPr>
+          <w:rFonts w:ascii="Calibri" w:cs="Calibri" w:eastAsia="Calibri" w:hAnsi="Calibri"/>
+          <w:sz w:val="21"/>
+          <w:szCs w:val="21"/>
+        </w:rPr>
+        <w:t xml:space="preserve">Client-provided Placer.ai device-based migration exports (eight files, archived in the deal file's `data/placerai/`; full analysis in appendix K) extend the demand picture through June 2026:</w:t>
+      </w:r>
+    </w:p>
+    <w:tbl>
+      <w:tblPr>
+        <w:tblW w:type="dxa" w:w="9360"/>
+        <w:tblBorders>
+          <w:top w:val="single" w:color="9AA69C" w:sz="4"/>
+          <w:left w:val="none"/>
+          <w:bottom w:val="single" w:color="9AA69C" w:sz="4"/>
+          <w:right w:val="none"/>
+          <w:insideH w:val="single" w:color="D5DBD4" w:sz="2"/>
+          <w:insideV w:val="none"/>
+        </w:tblBorders>
+      </w:tblPr>
+      <w:tblGrid>
+        <w:gridCol w:w="3182"/>
+        <w:gridCol w:w="3089"/>
+        <w:gridCol w:w="3089"/>
+      </w:tblGrid>
+      <w:tr>
+        <w:trPr>
+          <w:tblHeader/>
+        </w:trPr>
+        <w:tc>
+          <w:tcPr>
+            <w:tcW w:type="dxa" w:w="3182"/>
+            <w:shd w:fill="E8EDE7" w:val="clear"/>
+            <w:tcMar>
+              <w:top w:type="dxa" w:w="60"/>
+              <w:left w:type="dxa" w:w="100"/>
+              <w:bottom w:type="dxa" w:w="60"/>
+              <w:right w:type="dxa" w:w="100"/>
+            </w:tcMar>
+          </w:tcPr>
+          <w:p>
+            <w:pPr>
+              <w:spacing w:after="0"/>
+              <w:jc w:val="left"/>
+            </w:pPr>
+            <w:r>
+              <w:rPr>
+                <w:rFonts w:ascii="Calibri" w:cs="Calibri" w:eastAsia="Calibri" w:hAnsi="Calibri"/>
+                <w:b/>
+                <w:bCs/>
+                <w:sz w:val="18"/>
+                <w:szCs w:val="18"/>
+              </w:rPr>
+              <w:t xml:space="preserve">Measure</w:t>
+            </w:r>
+          </w:p>
+        </w:tc>
+        <w:tc>
+          <w:tcPr>
+            <w:tcW w:type="dxa" w:w="3089"/>
+            <w:shd w:fill="E8EDE7" w:val="clear"/>
+            <w:tcMar>
+              <w:top w:type="dxa" w:w="60"/>
+              <w:left w:type="dxa" w:w="100"/>
+              <w:bottom w:type="dxa" w:w="60"/>
+              <w:right w:type="dxa" w:w="100"/>
+            </w:tcMar>
+          </w:tcPr>
+          <w:p>
+            <w:pPr>
+              <w:spacing w:after="0"/>
+              <w:jc w:val="right"/>
+            </w:pPr>
+            <w:r>
+              <w:rPr>
+                <w:rFonts w:ascii="Calibri" w:cs="Calibri" w:eastAsia="Calibri" w:hAnsi="Calibri"/>
+                <w:b/>
+                <w:bCs/>
+                <w:sz w:val="18"/>
+                <w:szCs w:val="18"/>
+              </w:rPr>
+              <w:t xml:space="preserve">YE Jun 2025</w:t>
+            </w:r>
+          </w:p>
+        </w:tc>
+        <w:tc>
+          <w:tcPr>
+            <w:tcW w:type="dxa" w:w="3089"/>
+            <w:shd w:fill="E8EDE7" w:val="clear"/>
+            <w:tcMar>
+              <w:top w:type="dxa" w:w="60"/>
+              <w:left w:type="dxa" w:w="100"/>
+              <w:bottom w:type="dxa" w:w="60"/>
+              <w:right w:type="dxa" w:w="100"/>
+            </w:tcMar>
+          </w:tcPr>
+          <w:p>
+            <w:pPr>
+              <w:spacing w:after="0"/>
+              <w:jc w:val="right"/>
+            </w:pPr>
+            <w:r>
+              <w:rPr>
+                <w:rFonts w:ascii="Calibri" w:cs="Calibri" w:eastAsia="Calibri" w:hAnsi="Calibri"/>
+                <w:b/>
+                <w:bCs/>
+                <w:sz w:val="18"/>
+                <w:szCs w:val="18"/>
+              </w:rPr>
+              <w:t xml:space="preserve">YE Jun 2026</w:t>
+            </w:r>
+          </w:p>
+        </w:tc>
+      </w:tr>
+      <w:tr>
+        <w:trPr>
+          <w:tblHeader w:val="false"/>
+        </w:trPr>
+        <w:tc>
+          <w:tcPr>
+            <w:tcW w:type="dxa" w:w="3182"/>
+            <w:tcMar>
+              <w:top w:type="dxa" w:w="60"/>
+              <w:left w:type="dxa" w:w="100"/>
+              <w:bottom w:type="dxa" w:w="60"/>
+              <w:right w:type="dxa" w:w="100"/>
+            </w:tcMar>
+          </w:tcPr>
+          <w:p>
+            <w:pPr>
+              <w:spacing w:after="0"/>
+              <w:jc w:val="left"/>
+            </w:pPr>
+            <w:r>
+              <w:rPr>
+                <w:rFonts w:ascii="Calibri" w:cs="Calibri" w:eastAsia="Calibri" w:hAnsi="Calibri"/>
+                <w:sz w:val="18"/>
+                <w:szCs w:val="18"/>
+              </w:rPr>
+              <w:t xml:space="preserve">Boise MSA net domestic migration</w:t>
+            </w:r>
+          </w:p>
+        </w:tc>
+        <w:tc>
+          <w:tcPr>
+            <w:tcW w:type="dxa" w:w="3089"/>
+            <w:tcMar>
+              <w:top w:type="dxa" w:w="60"/>
+              <w:left w:type="dxa" w:w="100"/>
+              <w:bottom w:type="dxa" w:w="60"/>
+              <w:right w:type="dxa" w:w="100"/>
+            </w:tcMar>
+          </w:tcPr>
+          <w:p>
+            <w:pPr>
+              <w:spacing w:after="0"/>
+              <w:jc w:val="right"/>
+            </w:pPr>
+            <w:r>
+              <w:rPr>
+                <w:rFonts w:ascii="Calibri" w:cs="Calibri" w:eastAsia="Calibri" w:hAnsi="Calibri"/>
+                <w:sz w:val="18"/>
+                <w:szCs w:val="18"/>
+              </w:rPr>
+              <w:t xml:space="preserve">+6,051</w:t>
+            </w:r>
+          </w:p>
+        </w:tc>
+        <w:tc>
+          <w:tcPr>
+            <w:tcW w:type="dxa" w:w="3089"/>
+            <w:tcMar>
+              <w:top w:type="dxa" w:w="60"/>
+              <w:left w:type="dxa" w:w="100"/>
+              <w:bottom w:type="dxa" w:w="60"/>
+              <w:right w:type="dxa" w:w="100"/>
+            </w:tcMar>
+          </w:tcPr>
+          <w:p>
+            <w:pPr>
+              <w:spacing w:after="0"/>
+              <w:jc w:val="right"/>
+            </w:pPr>
+            <w:r>
+              <w:rPr>
+                <w:rFonts w:ascii="Calibri" w:cs="Calibri" w:eastAsia="Calibri" w:hAnsi="Calibri"/>
+                <w:sz w:val="18"/>
+                <w:szCs w:val="18"/>
+              </w:rPr>
+              <w:t xml:space="preserve">+11,647</w:t>
+            </w:r>
+          </w:p>
+        </w:tc>
+      </w:tr>
+      <w:tr>
+        <w:trPr>
+          <w:tblHeader w:val="false"/>
+        </w:trPr>
+        <w:tc>
+          <w:tcPr>
+            <w:tcW w:type="dxa" w:w="3182"/>
+            <w:tcMar>
+              <w:top w:type="dxa" w:w="60"/>
+              <w:left w:type="dxa" w:w="100"/>
+              <w:bottom w:type="dxa" w:w="60"/>
+              <w:right w:type="dxa" w:w="100"/>
+            </w:tcMar>
+          </w:tcPr>
+          <w:p>
+            <w:pPr>
+              <w:spacing w:after="0"/>
+              <w:jc w:val="left"/>
+            </w:pPr>
+            <w:r>
+              <w:rPr>
+                <w:rFonts w:ascii="Calibri" w:cs="Calibri" w:eastAsia="Calibri" w:hAnsi="Calibri"/>
+                <w:sz w:val="18"/>
+                <w:szCs w:val="18"/>
+              </w:rPr>
+              <w:t xml:space="preserve">Total growth (incl. natural + international)</w:t>
+            </w:r>
+          </w:p>
+        </w:tc>
+        <w:tc>
+          <w:tcPr>
+            <w:tcW w:type="dxa" w:w="3089"/>
+            <w:tcMar>
+              <w:top w:type="dxa" w:w="60"/>
+              <w:left w:type="dxa" w:w="100"/>
+              <w:bottom w:type="dxa" w:w="60"/>
+              <w:right w:type="dxa" w:w="100"/>
+            </w:tcMar>
+          </w:tcPr>
+          <w:p>
+            <w:pPr>
+              <w:spacing w:after="0"/>
+              <w:jc w:val="right"/>
+            </w:pPr>
+            <w:r>
+              <w:rPr>
+                <w:rFonts w:ascii="Calibri" w:cs="Calibri" w:eastAsia="Calibri" w:hAnsi="Calibri"/>
+                <w:sz w:val="18"/>
+                <w:szCs w:val="18"/>
+              </w:rPr>
+              <w:t xml:space="preserve">+13,042</w:t>
+            </w:r>
+          </w:p>
+        </w:tc>
+        <w:tc>
+          <w:tcPr>
+            <w:tcW w:type="dxa" w:w="3089"/>
+            <w:tcMar>
+              <w:top w:type="dxa" w:w="60"/>
+              <w:left w:type="dxa" w:w="100"/>
+              <w:bottom w:type="dxa" w:w="60"/>
+              <w:right w:type="dxa" w:w="100"/>
+            </w:tcMar>
+          </w:tcPr>
+          <w:p>
+            <w:pPr>
+              <w:spacing w:after="0"/>
+              <w:jc w:val="right"/>
+            </w:pPr>
+            <w:r>
+              <w:rPr>
+                <w:rFonts w:ascii="Calibri" w:cs="Calibri" w:eastAsia="Calibri" w:hAnsi="Calibri"/>
+                <w:sz w:val="18"/>
+                <w:szCs w:val="18"/>
+              </w:rPr>
+              <w:t xml:space="preserve">+18,769</w:t>
+            </w:r>
+          </w:p>
+        </w:tc>
+      </w:tr>
+      <w:tr>
+        <w:trPr>
+          <w:tblHeader w:val="false"/>
+        </w:trPr>
+        <w:tc>
+          <w:tcPr>
+            <w:tcW w:type="dxa" w:w="3182"/>
+            <w:tcMar>
+              <w:top w:type="dxa" w:w="60"/>
+              <w:left w:type="dxa" w:w="100"/>
+              <w:bottom w:type="dxa" w:w="60"/>
+              <w:right w:type="dxa" w:w="100"/>
+            </w:tcMar>
+          </w:tcPr>
+          <w:p>
+            <w:pPr>
+              <w:spacing w:after="0"/>
+              <w:jc w:val="left"/>
+            </w:pPr>
+            <w:r>
+              <w:rPr>
+                <w:rFonts w:ascii="Calibri" w:cs="Calibri" w:eastAsia="Calibri" w:hAnsi="Calibri"/>
+                <w:sz w:val="18"/>
+                <w:szCs w:val="18"/>
+              </w:rPr>
+              <w:t xml:space="preserve">Gross inbound</w:t>
+            </w:r>
+          </w:p>
+        </w:tc>
+        <w:tc>
+          <w:tcPr>
+            <w:tcW w:type="dxa" w:w="3089"/>
+            <w:tcMar>
+              <w:top w:type="dxa" w:w="60"/>
+              <w:left w:type="dxa" w:w="100"/>
+              <w:bottom w:type="dxa" w:w="60"/>
+              <w:right w:type="dxa" w:w="100"/>
+            </w:tcMar>
+          </w:tcPr>
+          <w:p>
+            <w:pPr>
+              <w:spacing w:after="0"/>
+              <w:jc w:val="right"/>
+            </w:pPr>
+            <w:r>
+              <w:rPr>
+                <w:rFonts w:ascii="Calibri" w:cs="Calibri" w:eastAsia="Calibri" w:hAnsi="Calibri"/>
+                <w:sz w:val="18"/>
+                <w:szCs w:val="18"/>
+              </w:rPr>
+              <w:t xml:space="preserve">21,134</w:t>
+            </w:r>
+          </w:p>
+        </w:tc>
+        <w:tc>
+          <w:tcPr>
+            <w:tcW w:type="dxa" w:w="3089"/>
+            <w:tcMar>
+              <w:top w:type="dxa" w:w="60"/>
+              <w:left w:type="dxa" w:w="100"/>
+              <w:bottom w:type="dxa" w:w="60"/>
+              <w:right w:type="dxa" w:w="100"/>
+            </w:tcMar>
+          </w:tcPr>
+          <w:p>
+            <w:pPr>
+              <w:spacing w:after="0"/>
+              <w:jc w:val="right"/>
+            </w:pPr>
+            <w:r>
+              <w:rPr>
+                <w:rFonts w:ascii="Calibri" w:cs="Calibri" w:eastAsia="Calibri" w:hAnsi="Calibri"/>
+                <w:sz w:val="18"/>
+                <w:szCs w:val="18"/>
+              </w:rPr>
+              <w:t xml:space="preserve">27,875</w:t>
+            </w:r>
+          </w:p>
+        </w:tc>
+      </w:tr>
+      <w:tr>
+        <w:trPr>
+          <w:tblHeader w:val="false"/>
+        </w:trPr>
+        <w:tc>
+          <w:tcPr>
+            <w:tcW w:type="dxa" w:w="3182"/>
+            <w:tcMar>
+              <w:top w:type="dxa" w:w="60"/>
+              <w:left w:type="dxa" w:w="100"/>
+              <w:bottom w:type="dxa" w:w="60"/>
+              <w:right w:type="dxa" w:w="100"/>
+            </w:tcMar>
+          </w:tcPr>
+          <w:p>
+            <w:pPr>
+              <w:spacing w:after="0"/>
+              <w:jc w:val="left"/>
+            </w:pPr>
+            <w:r>
+              <w:rPr>
+                <w:rFonts w:ascii="Calibri" w:cs="Calibri" w:eastAsia="Calibri" w:hAnsi="Calibri"/>
+                <w:sz w:val="18"/>
+                <w:szCs w:val="18"/>
+              </w:rPr>
+              <w:t xml:space="preserve">Valley ZIP-level net (independent cut)</w:t>
+            </w:r>
+          </w:p>
+        </w:tc>
+        <w:tc>
+          <w:tcPr>
+            <w:tcW w:type="dxa" w:w="3089"/>
+            <w:tcMar>
+              <w:top w:type="dxa" w:w="60"/>
+              <w:left w:type="dxa" w:w="100"/>
+              <w:bottom w:type="dxa" w:w="60"/>
+              <w:right w:type="dxa" w:w="100"/>
+            </w:tcMar>
+          </w:tcPr>
+          <w:p>
+            <w:pPr>
+              <w:spacing w:after="0"/>
+              <w:jc w:val="right"/>
+            </w:pPr>
+            <w:r>
+              <w:rPr>
+                <w:rFonts w:ascii="Calibri" w:cs="Calibri" w:eastAsia="Calibri" w:hAnsi="Calibri"/>
+                <w:sz w:val="18"/>
+                <w:szCs w:val="18"/>
+              </w:rPr>
+              <w:t xml:space="preserve">+6,045</w:t>
+            </w:r>
+          </w:p>
+        </w:tc>
+        <w:tc>
+          <w:tcPr>
+            <w:tcW w:type="dxa" w:w="3089"/>
+            <w:tcMar>
+              <w:top w:type="dxa" w:w="60"/>
+              <w:left w:type="dxa" w:w="100"/>
+              <w:bottom w:type="dxa" w:w="60"/>
+              <w:right w:type="dxa" w:w="100"/>
+            </w:tcMar>
+          </w:tcPr>
+          <w:p>
+            <w:pPr>
+              <w:spacing w:after="0"/>
+              <w:jc w:val="right"/>
+            </w:pPr>
+            <w:r>
+              <w:rPr>
+                <w:rFonts w:ascii="Calibri" w:cs="Calibri" w:eastAsia="Calibri" w:hAnsi="Calibri"/>
+                <w:sz w:val="18"/>
+                <w:szCs w:val="18"/>
+              </w:rPr>
+              <w:t xml:space="preserve">+10,445</w:t>
+            </w:r>
+          </w:p>
+        </w:tc>
+      </w:tr>
+    </w:tbl>
+    <w:p>
+      <w:pPr>
+        <w:spacing w:after="80"/>
+      </w:pPr>
+    </w:p>
+    <w:p>
+      <w:pPr>
+        <w:spacing w:after="120" w:line="276"/>
+        <w:jc w:val="both"/>
+      </w:pPr>
+      <w:r>
+        <w:rPr>
+          <w:rFonts w:ascii="Calibri" w:cs="Calibri" w:eastAsia="Calibri" w:hAnsi="Calibri"/>
+          <w:sz w:val="21"/>
+          <w:szCs w:val="21"/>
+        </w:rPr>
+        <w:t xml:space="preserve">Boise ranks </w:t>
+      </w:r>
+      <w:r>
+        <w:rPr>
+          <w:rFonts w:ascii="Calibri" w:cs="Calibri" w:eastAsia="Calibri" w:hAnsi="Calibri"/>
+          <w:b/>
+          <w:bCs/>
+          <w:sz w:val="21"/>
+          <w:szCs w:val="21"/>
+        </w:rPr>
+        <w:t xml:space="preserve">#5 of 925 US CBSAs</w:t>
+      </w:r>
+      <w:r>
+        <w:rPr>
+          <w:rFonts w:ascii="Calibri" w:cs="Calibri" w:eastAsia="Calibri" w:hAnsi="Calibri"/>
+          <w:sz w:val="21"/>
+          <w:szCs w:val="21"/>
+        </w:rPr>
+        <w:t xml:space="preserve"> in absolute net migration (+12,398 per the national file) and #5 by rate (+1.45%) — ahead of Phoenix (+744), Denver (+1,046), SLC (+1,530), and Las Vegas (−3,950) combined. California supplies 47% of the net inflow; the Washington DC feeder doubled year-over-year (+338, $127K feeder MHHI) — the federal-exodus channel landing in Boise. </w:t>
+      </w:r>
+      <w:r>
+        <w:rPr>
+          <w:rFonts w:ascii="Calibri" w:cs="Calibri" w:eastAsia="Calibri" w:hAnsi="Calibri"/>
+          <w:b/>
+          <w:bCs/>
+          <w:sz w:val="21"/>
+          <w:szCs w:val="21"/>
+        </w:rPr>
+        <w:t xml:space="preserve">Ada County is the #8 migration county in America (+8,552, +1.58%). ZIP 83642 — containing the subject — is the metro's #1 net-in-migration ZIP (+2,417, +34.7/1,000, accelerating +1,077 over the prior year), while north Meridian (83646) decelerated — growth is rotating into the subject's corridor.</w:t>
+      </w:r>
+      <w:r>
+        <w:rPr>
+          <w:rFonts w:ascii="Calibri" w:cs="Calibri" w:eastAsia="Calibri" w:hAnsi="Calibri"/>
+          <w:sz w:val="21"/>
+          <w:szCs w:val="21"/>
+        </w:rPr>
+        <w:t xml:space="preserve"> In-migrant income matches incumbent income (ratio ~1.00): the metro is importing its own income distribution.</w:t>
+      </w:r>
+    </w:p>
+    <w:p>
+      <w:pPr>
+        <w:spacing w:after="120" w:line="276"/>
+        <w:jc w:val="both"/>
+      </w:pPr>
+      <w:r>
+        <w:rPr>
+          <w:rFonts w:ascii="Calibri" w:cs="Calibri" w:eastAsia="Calibri" w:hAnsi="Calibri"/>
+          <w:sz w:val="21"/>
+          <w:szCs w:val="21"/>
+        </w:rPr>
+        <w:t xml:space="preserve">Caveats: the three Placer exports give net-migration levels of +8.5K/+11.6K/+12.4K for the same year (table truncation vs model totals) — treat the level as ~+11–12K and the </w:t>
+      </w:r>
+      <w:r>
+        <w:rPr>
+          <w:rFonts w:ascii="Calibri" w:cs="Calibri" w:eastAsia="Calibri" w:hAnsi="Calibri"/>
+          <w:i/>
+          <w:iCs/>
+          <w:sz w:val="21"/>
+          <w:szCs w:val="21"/>
+        </w:rPr>
+        <w:t xml:space="preserve">near-doubling trend</w:t>
+      </w:r>
+      <w:r>
+        <w:rPr>
+          <w:rFonts w:ascii="Calibri" w:cs="Calibri" w:eastAsia="Calibri" w:hAnsi="Calibri"/>
+          <w:sz w:val="21"/>
+          <w:szCs w:val="21"/>
+        </w:rPr>
+        <w:t xml:space="preserve"> as the robust finding; device-panel levels are model outputs, most reliable in year-over-year comparison within the same methodology. Official confirmation arrives with Census Vintage 2026 (December 2026–March 2027), which joins the September 2026 QCEW pull as the second diligence checkpoint.</w:t>
+      </w:r>
+    </w:p>
+    <w:p>
+      <w:pPr>
+        <w:pStyle w:val="Heading1"/>
+        <w:pageBreakBefore/>
+        <w:spacing w:after="160" w:before="240"/>
+      </w:pPr>
+      <w:r>
+        <w:rPr>
+          <w:rFonts w:ascii="Georgia" w:cs="Georgia" w:eastAsia="Georgia" w:hAnsi="Georgia"/>
+          <w:b/>
+          <w:bCs/>
+          <w:color w:val="1D231F"/>
+          <w:sz w:val="32"/>
+          <w:szCs w:val="32"/>
+        </w:rPr>
+        <w:t xml:space="preserve">Appendix VI: Source Base</w:t>
       </w:r>
     </w:p>
     <w:p>

</xml_diff>

<commit_message>
Excel data compilation + remove replacement-cost material from employment research
- New: 'Boise Economy & Population - Data Compilation.xlsx' — 12 tabs
  (T3M summary, CES monthly 2019-2026, QCEW vs CES, cross-metro,
  labor/wages, population/migration, Placer feeders/ZIPs, employers,
  projections/catalysts/risks, sources & checkpoints)
- Data re-verified 8/13/26: CES flat file re-download md5-identical
  (T3M +0.42% reproduced); QCEW fresh re-pull confirms Ada +2.51%,
  Canyon +2.09%; QCEW Q1-2026 confirmed unpublished
- Replacement-cost/comps removed from the research paper (§9 deleted,
  exec summary + source base adjusted; docx rebuilt); appendix I moved
  to valuation/ as a separate workstream

Co-Authored-By: Claude Fable 5 <noreply@anthropic.com>
Claude-Session: https://claude.ai/code/session_018pjKPrYAW2u8zH3WtQwHiV
</commit_message>
<xml_diff>
--- a/employment-drivers/The Boise Slowdown - Research Paper.docx
+++ b/employment-drivers/The Boise Slowdown - Research Paper.docx
@@ -727,61 +727,7 @@
           <w:sz w:val="21"/>
           <w:szCs w:val="21"/>
         </w:rPr>
-        <w:t xml:space="preserve"> — below the hard-data trend for conservatism, above the artifact-depressed CES print — while recognizing that Boise apartment demand is only partially payroll-coupled (retirees, remote workers, and priced-out would-be buyers rent without appearing in local payrolls). This paper also corrects the prior memo's replacement-cost analysis (Section 9): institutional replacement cost for a Seasons-equivalent is </w:t>
-      </w:r>
-      <w:r>
-        <w:rPr>
-          <w:rFonts w:ascii="Calibri" w:cs="Calibri" w:eastAsia="Calibri" w:hAnsi="Calibri"/>
-          <w:b/>
-          <w:bCs/>
-          <w:sz w:val="21"/>
-          <w:szCs w:val="21"/>
-        </w:rPr>
-        <w:t xml:space="preserve">~$300–340K/unit</w:t>
-      </w:r>
-      <w:r>
-        <w:rPr>
-          <w:rFonts w:ascii="Calibri" w:cs="Calibri" w:eastAsia="Calibri" w:hAnsi="Calibri"/>
-          <w:sz w:val="21"/>
-          <w:szCs w:val="21"/>
-        </w:rPr>
-        <w:t xml:space="preserve">, Class A 2020s-vintage clearing prices in Ada County are </w:t>
-      </w:r>
-      <w:r>
-        <w:rPr>
-          <w:rFonts w:ascii="Calibri" w:cs="Calibri" w:eastAsia="Calibri" w:hAnsi="Calibri"/>
-          <w:b/>
-          <w:bCs/>
-          <w:sz w:val="21"/>
-          <w:szCs w:val="21"/>
-        </w:rPr>
-        <w:t xml:space="preserve">~$250–340K/unit</w:t>
-      </w:r>
-      <w:r>
-        <w:rPr>
-          <w:rFonts w:ascii="Calibri" w:cs="Calibri" w:eastAsia="Calibri" w:hAnsi="Calibri"/>
-          <w:sz w:val="21"/>
-          <w:szCs w:val="21"/>
-        </w:rPr>
-        <w:t xml:space="preserve">, and a ~$328K/unit valuation is replacement-cost </w:t>
-      </w:r>
-      <w:r>
-        <w:rPr>
-          <w:rFonts w:ascii="Calibri" w:cs="Calibri" w:eastAsia="Calibri" w:hAnsi="Calibri"/>
-          <w:i/>
-          <w:iCs/>
-          <w:sz w:val="21"/>
-          <w:szCs w:val="21"/>
-        </w:rPr>
-        <w:t xml:space="preserve">parity</w:t>
-      </w:r>
-      <w:r>
-        <w:rPr>
-          <w:rFonts w:ascii="Calibri" w:cs="Calibri" w:eastAsia="Calibri" w:hAnsi="Calibri"/>
-          <w:sz w:val="21"/>
-          <w:szCs w:val="21"/>
-        </w:rPr>
-        <w:t xml:space="preserve"> at the metro's best node — while the construction pipeline sits at 2–3.5% of inventory because development math remains broken by a 25–35% rent gap.</w:t>
+        <w:t xml:space="preserve"> — below the hard-data trend for conservatism, above the artifact-depressed CES print — while recognizing that Boise apartment demand is only partially payroll-coupled (retirees, remote workers, and priced-out would-be buyers rent without appearing in local payrolls). (Valuation, comps, and replacement-cost analysis are maintained separately in the deal file's `valuation/` folder — outside the scope of this paper.)</w:t>
       </w:r>
     </w:p>
     <w:p>
@@ -8225,7 +8171,7 @@
           <w:sz w:val="32"/>
           <w:szCs w:val="32"/>
         </w:rPr>
-        <w:t xml:space="preserve">9. Corrigendum: Replacement Cost and Class A Clearing Prices</w:t>
+        <w:t xml:space="preserve">Appendix I: Methodology</w:t>
       </w:r>
     </w:p>
     <w:p>
@@ -8236,45 +8182,44 @@
       <w:r>
         <w:rPr>
           <w:rFonts w:ascii="Calibri" w:cs="Calibri" w:eastAsia="Calibri" w:hAnsi="Calibri"/>
-          <w:sz w:val="21"/>
-          <w:szCs w:val="21"/>
-        </w:rPr>
-        <w:t xml:space="preserve">The v2 memo asserted that Boise trades cleared at $165–222K/unit (~$200K average) against replacement cost of ~$220–280K/unit, and characterized at/above-replacement pricing as a 30–60% premium to market. </w:t>
-      </w:r>
-      <w:r>
-        <w:rPr>
-          <w:rFonts w:ascii="Calibri" w:cs="Calibri" w:eastAsia="Calibri" w:hAnsi="Calibri"/>
           <w:b/>
           <w:bCs/>
           <w:sz w:val="21"/>
           <w:szCs w:val="21"/>
         </w:rPr>
-        <w:t xml:space="preserve">That analysis was wrong</w:t>
-      </w:r>
-      <w:r>
-        <w:rPr>
-          <w:rFonts w:ascii="Calibri" w:cs="Calibri" w:eastAsia="Calibri" w:hAnsi="Calibri"/>
-          <w:sz w:val="21"/>
-          <w:szCs w:val="21"/>
-        </w:rPr>
-        <w:t xml:space="preserve">, and this section replaces it.</w:t>
-      </w:r>
-    </w:p>
-    <w:p>
-      <w:pPr>
-        <w:pStyle w:val="Heading2"/>
-        <w:spacing w:after="100" w:before="220"/>
-      </w:pPr>
-      <w:r>
-        <w:rPr>
-          <w:rFonts w:ascii="Georgia" w:cs="Georgia" w:eastAsia="Georgia" w:hAnsi="Georgia"/>
+        <w:t xml:space="preserve">T3M construction:</w:t>
+      </w:r>
+      <w:r>
+        <w:rPr>
+          <w:rFonts w:ascii="Calibri" w:cs="Calibri" w:eastAsia="Calibri" w:hAnsi="Calibri"/>
+          <w:sz w:val="21"/>
+          <w:szCs w:val="21"/>
+        </w:rPr>
+        <w:t xml:space="preserve"> 3-month arithmetic mean of NSA CES employment ending in the stated month, compared to the identical window one year prior. Sources: BLS SM flat files (`sm.data.13.Idaho`, `sm.data.54.TotalNonFarm.All`), series IDs in `appendix/E` of the deal file; US comparisons from FRED (PAYNSA and SA supersector series for shift-share).</w:t>
+      </w:r>
+    </w:p>
+    <w:p>
+      <w:pPr>
+        <w:spacing w:after="120" w:line="276"/>
+        <w:jc w:val="both"/>
+      </w:pPr>
+      <w:r>
+        <w:rPr>
+          <w:rFonts w:ascii="Calibri" w:cs="Calibri" w:eastAsia="Calibri" w:hAnsi="Calibri"/>
           <w:b/>
           <w:bCs/>
-          <w:color w:val="2E5E4E"/>
-          <w:sz w:val="25"/>
-          <w:szCs w:val="25"/>
-        </w:rPr>
-        <w:t xml:space="preserve">9.1 Why it was wrong</w:t>
+          <w:sz w:val="21"/>
+          <w:szCs w:val="21"/>
+        </w:rPr>
+        <w:t xml:space="preserve">Shift-share:</w:t>
+      </w:r>
+      <w:r>
+        <w:rPr>
+          <w:rFonts w:ascii="Calibri" w:cs="Calibri" w:eastAsia="Calibri" w:hAnsi="Calibri"/>
+          <w:sz w:val="21"/>
+          <w:szCs w:val="21"/>
+        </w:rPr>
+        <w:t xml:space="preserve"> expected sector change = Boise sector base employment (prior-year T3M) × national sector T3M YoY growth; local residual = actual − expected. National sector rates use SA series (YoY comparisons are insensitive to seasonal adjustment).</w:t>
       </w:r>
     </w:p>
     <w:p>
@@ -8285,45 +8230,44 @@
       <w:r>
         <w:rPr>
           <w:rFonts w:ascii="Calibri" w:cs="Calibri" w:eastAsia="Calibri" w:hAnsi="Calibri"/>
-          <w:sz w:val="21"/>
-          <w:szCs w:val="21"/>
-        </w:rPr>
-        <w:t xml:space="preserve">The range came from a single brokerage report (Lee &amp; Associates Q2 2025) whose trailing-12-month "top transactions" consisted of three sub-institutional deals: a 2017-vintage 2-story Nampa asset ($165K/unit), a 102-unit 2023 build in west Boise ($221.7K/unit — only ~$205/SF), and a 76-unit infill deal ($200K/unit). Idaho is a non-disclosure state; the public tape is thin and skews small, old, and Canyon County. The same brokerage's own quarterly series printed </w:t>
-      </w:r>
-      <w:r>
-        <w:rPr>
-          <w:rFonts w:ascii="Calibri" w:cs="Calibri" w:eastAsia="Calibri" w:hAnsi="Calibri"/>
           <w:b/>
           <w:bCs/>
           <w:sz w:val="21"/>
           <w:szCs w:val="21"/>
         </w:rPr>
-        <w:t xml:space="preserve">$348K/unit average in Q1 2025</w:t>
-      </w:r>
-      <w:r>
-        <w:rPr>
-          <w:rFonts w:ascii="Calibri" w:cs="Calibri" w:eastAsia="Calibri" w:hAnsi="Calibri"/>
-          <w:sz w:val="21"/>
-          <w:szCs w:val="21"/>
-        </w:rPr>
-        <w:t xml:space="preserve"> — the quarters in which institutional newer-vintage product actually trades triple the average.</w:t>
-      </w:r>
-    </w:p>
-    <w:p>
-      <w:pPr>
-        <w:pStyle w:val="Heading2"/>
-        <w:spacing w:after="100" w:before="220"/>
-      </w:pPr>
-      <w:r>
-        <w:rPr>
-          <w:rFonts w:ascii="Georgia" w:cs="Georgia" w:eastAsia="Georgia" w:hAnsi="Georgia"/>
+        <w:t xml:space="preserve">QCEW:</w:t>
+      </w:r>
+      <w:r>
+        <w:rPr>
+          <w:rFonts w:ascii="Calibri" w:cs="Calibri" w:eastAsia="Calibri" w:hAnsi="Calibri"/>
+          <w:sz w:val="21"/>
+          <w:szCs w:val="21"/>
+        </w:rPr>
+        <w:t xml:space="preserve"> BLS QCEW open-data API, county area files (16001 Ada, 16027 Canyon), total covered employment = own_code 0 / industry 10, quarterly average of the three monthly employment levels; sector rows own_code 5 (private), 2-digit NAICS. Q4 2025 is the latest available quarter (published June 2026); Q1 2026 publishes ~September 2026.</w:t>
+      </w:r>
+    </w:p>
+    <w:p>
+      <w:pPr>
+        <w:spacing w:after="120" w:line="276"/>
+        <w:jc w:val="both"/>
+      </w:pPr>
+      <w:r>
+        <w:rPr>
+          <w:rFonts w:ascii="Calibri" w:cs="Calibri" w:eastAsia="Calibri" w:hAnsi="Calibri"/>
           <w:b/>
           <w:bCs/>
-          <w:color w:val="2E5E4E"/>
-          <w:sz w:val="25"/>
-          <w:szCs w:val="25"/>
-        </w:rPr>
-        <w:t xml:space="preserve">9.2 The corrected Class A record</w:t>
+          <w:sz w:val="21"/>
+          <w:szCs w:val="21"/>
+        </w:rPr>
+        <w:t xml:space="preserve">Household employment:</w:t>
+      </w:r>
+      <w:r>
+        <w:rPr>
+          <w:rFonts w:ascii="Calibri" w:cs="Calibri" w:eastAsia="Calibri" w:hAnsi="Calibri"/>
+          <w:sz w:val="21"/>
+          <w:szCs w:val="21"/>
+        </w:rPr>
+        <w:t xml:space="preserve"> derived as labor force × (1 − unemployment rate) from FRED BOIS216LFN and BOIS216URN (LAUS). October 2025 is missing from the source series (shutdown-period gap).</w:t>
       </w:r>
     </w:p>
     <w:p>
@@ -8334,1443 +8278,20 @@
       <w:r>
         <w:rPr>
           <w:rFonts w:ascii="Calibri" w:cs="Calibri" w:eastAsia="Calibri" w:hAnsi="Calibri"/>
-          <w:sz w:val="21"/>
-          <w:szCs w:val="21"/>
-        </w:rPr>
-        <w:t xml:space="preserve">Institutional-size, 2018+ vintage Ada County trades (prices mostly undisclosed — Idaho non-disclosure — buyers/sellers verified):</w:t>
-      </w:r>
-    </w:p>
-    <w:tbl>
-      <w:tblPr>
-        <w:tblW w:type="dxa" w:w="9360"/>
-        <w:tblBorders>
-          <w:top w:val="single" w:color="9AA69C" w:sz="4"/>
-          <w:left w:val="none"/>
-          <w:bottom w:val="single" w:color="9AA69C" w:sz="4"/>
-          <w:right w:val="none"/>
-          <w:insideH w:val="single" w:color="D5DBD4" w:sz="2"/>
-          <w:insideV w:val="none"/>
-        </w:tblBorders>
-      </w:tblPr>
-      <w:tblGrid>
-        <w:gridCol w:w="3182"/>
-        <w:gridCol w:w="1236"/>
-        <w:gridCol w:w="1236"/>
-        <w:gridCol w:w="1236"/>
-        <w:gridCol w:w="1236"/>
-        <w:gridCol w:w="1234"/>
-      </w:tblGrid>
-      <w:tr>
-        <w:trPr>
-          <w:tblHeader/>
-        </w:trPr>
-        <w:tc>
-          <w:tcPr>
-            <w:tcW w:type="dxa" w:w="3182"/>
-            <w:shd w:fill="E8EDE7" w:val="clear"/>
-            <w:tcMar>
-              <w:top w:type="dxa" w:w="60"/>
-              <w:left w:type="dxa" w:w="100"/>
-              <w:bottom w:type="dxa" w:w="60"/>
-              <w:right w:type="dxa" w:w="100"/>
-            </w:tcMar>
-          </w:tcPr>
-          <w:p>
-            <w:pPr>
-              <w:spacing w:after="0"/>
-              <w:jc w:val="left"/>
-            </w:pPr>
-            <w:r>
-              <w:rPr>
-                <w:rFonts w:ascii="Calibri" w:cs="Calibri" w:eastAsia="Calibri" w:hAnsi="Calibri"/>
-                <w:b/>
-                <w:bCs/>
-                <w:sz w:val="18"/>
-                <w:szCs w:val="18"/>
-              </w:rPr>
-              <w:t xml:space="preserve">Date</w:t>
-            </w:r>
-          </w:p>
-        </w:tc>
-        <w:tc>
-          <w:tcPr>
-            <w:tcW w:type="dxa" w:w="1236"/>
-            <w:shd w:fill="E8EDE7" w:val="clear"/>
-            <w:tcMar>
-              <w:top w:type="dxa" w:w="60"/>
-              <w:left w:type="dxa" w:w="100"/>
-              <w:bottom w:type="dxa" w:w="60"/>
-              <w:right w:type="dxa" w:w="100"/>
-            </w:tcMar>
-          </w:tcPr>
-          <w:p>
-            <w:pPr>
-              <w:spacing w:after="0"/>
-              <w:jc w:val="right"/>
-            </w:pPr>
-            <w:r>
-              <w:rPr>
-                <w:rFonts w:ascii="Calibri" w:cs="Calibri" w:eastAsia="Calibri" w:hAnsi="Calibri"/>
-                <w:b/>
-                <w:bCs/>
-                <w:sz w:val="18"/>
-                <w:szCs w:val="18"/>
-              </w:rPr>
-              <w:t xml:space="preserve">Property</w:t>
-            </w:r>
-          </w:p>
-        </w:tc>
-        <w:tc>
-          <w:tcPr>
-            <w:tcW w:type="dxa" w:w="1236"/>
-            <w:shd w:fill="E8EDE7" w:val="clear"/>
-            <w:tcMar>
-              <w:top w:type="dxa" w:w="60"/>
-              <w:left w:type="dxa" w:w="100"/>
-              <w:bottom w:type="dxa" w:w="60"/>
-              <w:right w:type="dxa" w:w="100"/>
-            </w:tcMar>
-          </w:tcPr>
-          <w:p>
-            <w:pPr>
-              <w:spacing w:after="0"/>
-              <w:jc w:val="right"/>
-            </w:pPr>
-            <w:r>
-              <w:rPr>
-                <w:rFonts w:ascii="Calibri" w:cs="Calibri" w:eastAsia="Calibri" w:hAnsi="Calibri"/>
-                <w:b/>
-                <w:bCs/>
-                <w:sz w:val="18"/>
-                <w:szCs w:val="18"/>
-              </w:rPr>
-              <w:t xml:space="preserve">City</w:t>
-            </w:r>
-          </w:p>
-        </w:tc>
-        <w:tc>
-          <w:tcPr>
-            <w:tcW w:type="dxa" w:w="1236"/>
-            <w:shd w:fill="E8EDE7" w:val="clear"/>
-            <w:tcMar>
-              <w:top w:type="dxa" w:w="60"/>
-              <w:left w:type="dxa" w:w="100"/>
-              <w:bottom w:type="dxa" w:w="60"/>
-              <w:right w:type="dxa" w:w="100"/>
-            </w:tcMar>
-          </w:tcPr>
-          <w:p>
-            <w:pPr>
-              <w:spacing w:after="0"/>
-              <w:jc w:val="right"/>
-            </w:pPr>
-            <w:r>
-              <w:rPr>
-                <w:rFonts w:ascii="Calibri" w:cs="Calibri" w:eastAsia="Calibri" w:hAnsi="Calibri"/>
-                <w:b/>
-                <w:bCs/>
-                <w:sz w:val="18"/>
-                <w:szCs w:val="18"/>
-              </w:rPr>
-              <w:t xml:space="preserve">Units</w:t>
-            </w:r>
-          </w:p>
-        </w:tc>
-        <w:tc>
-          <w:tcPr>
-            <w:tcW w:type="dxa" w:w="1236"/>
-            <w:shd w:fill="E8EDE7" w:val="clear"/>
-            <w:tcMar>
-              <w:top w:type="dxa" w:w="60"/>
-              <w:left w:type="dxa" w:w="100"/>
-              <w:bottom w:type="dxa" w:w="60"/>
-              <w:right w:type="dxa" w:w="100"/>
-            </w:tcMar>
-          </w:tcPr>
-          <w:p>
-            <w:pPr>
-              <w:spacing w:after="0"/>
-              <w:jc w:val="right"/>
-            </w:pPr>
-            <w:r>
-              <w:rPr>
-                <w:rFonts w:ascii="Calibri" w:cs="Calibri" w:eastAsia="Calibri" w:hAnsi="Calibri"/>
-                <w:b/>
-                <w:bCs/>
-                <w:sz w:val="18"/>
-                <w:szCs w:val="18"/>
-              </w:rPr>
-              <w:t xml:space="preserve">Vintage</w:t>
-            </w:r>
-          </w:p>
-        </w:tc>
-        <w:tc>
-          <w:tcPr>
-            <w:tcW w:type="dxa" w:w="1234"/>
-            <w:shd w:fill="E8EDE7" w:val="clear"/>
-            <w:tcMar>
-              <w:top w:type="dxa" w:w="60"/>
-              <w:left w:type="dxa" w:w="100"/>
-              <w:bottom w:type="dxa" w:w="60"/>
-              <w:right w:type="dxa" w:w="100"/>
-            </w:tcMar>
-          </w:tcPr>
-          <w:p>
-            <w:pPr>
-              <w:spacing w:after="0"/>
-              <w:jc w:val="right"/>
-            </w:pPr>
-            <w:r>
-              <w:rPr>
-                <w:rFonts w:ascii="Calibri" w:cs="Calibri" w:eastAsia="Calibri" w:hAnsi="Calibri"/>
-                <w:b/>
-                <w:bCs/>
-                <w:sz w:val="18"/>
-                <w:szCs w:val="18"/>
-              </w:rPr>
-              <w:t xml:space="preserve">Parties</w:t>
-            </w:r>
-          </w:p>
-        </w:tc>
-      </w:tr>
-      <w:tr>
-        <w:trPr>
-          <w:tblHeader w:val="false"/>
-        </w:trPr>
-        <w:tc>
-          <w:tcPr>
-            <w:tcW w:type="dxa" w:w="3182"/>
-            <w:tcMar>
-              <w:top w:type="dxa" w:w="60"/>
-              <w:left w:type="dxa" w:w="100"/>
-              <w:bottom w:type="dxa" w:w="60"/>
-              <w:right w:type="dxa" w:w="100"/>
-            </w:tcMar>
-          </w:tcPr>
-          <w:p>
-            <w:pPr>
-              <w:spacing w:after="0"/>
-              <w:jc w:val="left"/>
-            </w:pPr>
-            <w:r>
-              <w:rPr>
-                <w:rFonts w:ascii="Calibri" w:cs="Calibri" w:eastAsia="Calibri" w:hAnsi="Calibri"/>
-                <w:sz w:val="18"/>
-                <w:szCs w:val="18"/>
-              </w:rPr>
-              <w:t xml:space="preserve">Feb 2021</w:t>
-            </w:r>
-          </w:p>
-        </w:tc>
-        <w:tc>
-          <w:tcPr>
-            <w:tcW w:type="dxa" w:w="1236"/>
-            <w:tcMar>
-              <w:top w:type="dxa" w:w="60"/>
-              <w:left w:type="dxa" w:w="100"/>
-              <w:bottom w:type="dxa" w:w="60"/>
-              <w:right w:type="dxa" w:w="100"/>
-            </w:tcMar>
-          </w:tcPr>
-          <w:p>
-            <w:pPr>
-              <w:spacing w:after="0"/>
-              <w:jc w:val="right"/>
-            </w:pPr>
-            <w:r>
-              <w:rPr>
-                <w:rFonts w:ascii="Calibri" w:cs="Calibri" w:eastAsia="Calibri" w:hAnsi="Calibri"/>
-                <w:sz w:val="18"/>
-                <w:szCs w:val="18"/>
-              </w:rPr>
-              <w:t xml:space="preserve">Indigo → Cortland South Meridian</w:t>
-            </w:r>
-          </w:p>
-        </w:tc>
-        <w:tc>
-          <w:tcPr>
-            <w:tcW w:type="dxa" w:w="1236"/>
-            <w:tcMar>
-              <w:top w:type="dxa" w:w="60"/>
-              <w:left w:type="dxa" w:w="100"/>
-              <w:bottom w:type="dxa" w:w="60"/>
-              <w:right w:type="dxa" w:w="100"/>
-            </w:tcMar>
-          </w:tcPr>
-          <w:p>
-            <w:pPr>
-              <w:spacing w:after="0"/>
-              <w:jc w:val="right"/>
-            </w:pPr>
-            <w:r>
-              <w:rPr>
-                <w:rFonts w:ascii="Calibri" w:cs="Calibri" w:eastAsia="Calibri" w:hAnsi="Calibri"/>
-                <w:sz w:val="18"/>
-                <w:szCs w:val="18"/>
-              </w:rPr>
-              <w:t xml:space="preserve">Meridian (Overland/Ten Mile)</w:t>
-            </w:r>
-          </w:p>
-        </w:tc>
-        <w:tc>
-          <w:tcPr>
-            <w:tcW w:type="dxa" w:w="1236"/>
-            <w:tcMar>
-              <w:top w:type="dxa" w:w="60"/>
-              <w:left w:type="dxa" w:w="100"/>
-              <w:bottom w:type="dxa" w:w="60"/>
-              <w:right w:type="dxa" w:w="100"/>
-            </w:tcMar>
-          </w:tcPr>
-          <w:p>
-            <w:pPr>
-              <w:spacing w:after="0"/>
-              <w:jc w:val="right"/>
-            </w:pPr>
-            <w:r>
-              <w:rPr>
-                <w:rFonts w:ascii="Calibri" w:cs="Calibri" w:eastAsia="Calibri" w:hAnsi="Calibri"/>
-                <w:sz w:val="18"/>
-                <w:szCs w:val="18"/>
-              </w:rPr>
-              <w:t xml:space="preserve">336</w:t>
-            </w:r>
-          </w:p>
-        </w:tc>
-        <w:tc>
-          <w:tcPr>
-            <w:tcW w:type="dxa" w:w="1236"/>
-            <w:tcMar>
-              <w:top w:type="dxa" w:w="60"/>
-              <w:left w:type="dxa" w:w="100"/>
-              <w:bottom w:type="dxa" w:w="60"/>
-              <w:right w:type="dxa" w:w="100"/>
-            </w:tcMar>
-          </w:tcPr>
-          <w:p>
-            <w:pPr>
-              <w:spacing w:after="0"/>
-              <w:jc w:val="right"/>
-            </w:pPr>
-            <w:r>
-              <w:rPr>
-                <w:rFonts w:ascii="Calibri" w:cs="Calibri" w:eastAsia="Calibri" w:hAnsi="Calibri"/>
-                <w:sz w:val="18"/>
-                <w:szCs w:val="18"/>
-              </w:rPr>
-              <w:t xml:space="preserve">~2019</w:t>
-            </w:r>
-          </w:p>
-        </w:tc>
-        <w:tc>
-          <w:tcPr>
-            <w:tcW w:type="dxa" w:w="1234"/>
-            <w:tcMar>
-              <w:top w:type="dxa" w:w="60"/>
-              <w:left w:type="dxa" w:w="100"/>
-              <w:bottom w:type="dxa" w:w="60"/>
-              <w:right w:type="dxa" w:w="100"/>
-            </w:tcMar>
-          </w:tcPr>
-          <w:p>
-            <w:pPr>
-              <w:spacing w:after="0"/>
-              <w:jc w:val="right"/>
-            </w:pPr>
-            <w:r>
-              <w:rPr>
-                <w:rFonts w:ascii="Calibri" w:cs="Calibri" w:eastAsia="Calibri" w:hAnsi="Calibri"/>
-                <w:sz w:val="18"/>
-                <w:szCs w:val="18"/>
-              </w:rPr>
-              <w:t xml:space="preserve">Cortland (buyer)</w:t>
-            </w:r>
-          </w:p>
-        </w:tc>
-      </w:tr>
-      <w:tr>
-        <w:trPr>
-          <w:tblHeader w:val="false"/>
-        </w:trPr>
-        <w:tc>
-          <w:tcPr>
-            <w:tcW w:type="dxa" w:w="3182"/>
-            <w:tcMar>
-              <w:top w:type="dxa" w:w="60"/>
-              <w:left w:type="dxa" w:w="100"/>
-              <w:bottom w:type="dxa" w:w="60"/>
-              <w:right w:type="dxa" w:w="100"/>
-            </w:tcMar>
-          </w:tcPr>
-          <w:p>
-            <w:pPr>
-              <w:spacing w:after="0"/>
-              <w:jc w:val="left"/>
-            </w:pPr>
-            <w:r>
-              <w:rPr>
-                <w:rFonts w:ascii="Calibri" w:cs="Calibri" w:eastAsia="Calibri" w:hAnsi="Calibri"/>
-                <w:sz w:val="18"/>
-                <w:szCs w:val="18"/>
-              </w:rPr>
-              <w:t xml:space="preserve">Jun 2021</w:t>
-            </w:r>
-          </w:p>
-        </w:tc>
-        <w:tc>
-          <w:tcPr>
-            <w:tcW w:type="dxa" w:w="1236"/>
-            <w:tcMar>
-              <w:top w:type="dxa" w:w="60"/>
-              <w:left w:type="dxa" w:w="100"/>
-              <w:bottom w:type="dxa" w:w="60"/>
-              <w:right w:type="dxa" w:w="100"/>
-            </w:tcMar>
-          </w:tcPr>
-          <w:p>
-            <w:pPr>
-              <w:spacing w:after="0"/>
-              <w:jc w:val="right"/>
-            </w:pPr>
-            <w:r>
-              <w:rPr>
-                <w:rFonts w:ascii="Calibri" w:cs="Calibri" w:eastAsia="Calibri" w:hAnsi="Calibri"/>
-                <w:sz w:val="18"/>
-                <w:szCs w:val="18"/>
-              </w:rPr>
-              <w:t xml:space="preserve">Kennedy Wilson portfolio (Lofts at Ten Mile, Jasper, Towne Sq + dev site)</w:t>
-            </w:r>
-          </w:p>
-        </w:tc>
-        <w:tc>
-          <w:tcPr>
-            <w:tcW w:type="dxa" w:w="1236"/>
-            <w:tcMar>
-              <w:top w:type="dxa" w:w="60"/>
-              <w:left w:type="dxa" w:w="100"/>
-              <w:bottom w:type="dxa" w:w="60"/>
-              <w:right w:type="dxa" w:w="100"/>
-            </w:tcMar>
-          </w:tcPr>
-          <w:p>
-            <w:pPr>
-              <w:spacing w:after="0"/>
-              <w:jc w:val="right"/>
-            </w:pPr>
-            <w:r>
-              <w:rPr>
-                <w:rFonts w:ascii="Calibri" w:cs="Calibri" w:eastAsia="Calibri" w:hAnsi="Calibri"/>
-                <w:sz w:val="18"/>
-                <w:szCs w:val="18"/>
-              </w:rPr>
-              <w:t xml:space="preserve">Meridian/Boise</w:t>
-            </w:r>
-          </w:p>
-        </w:tc>
-        <w:tc>
-          <w:tcPr>
-            <w:tcW w:type="dxa" w:w="1236"/>
-            <w:tcMar>
-              <w:top w:type="dxa" w:w="60"/>
-              <w:left w:type="dxa" w:w="100"/>
-              <w:bottom w:type="dxa" w:w="60"/>
-              <w:right w:type="dxa" w:w="100"/>
-            </w:tcMar>
-          </w:tcPr>
-          <w:p>
-            <w:pPr>
-              <w:spacing w:after="0"/>
-              <w:jc w:val="right"/>
-            </w:pPr>
-            <w:r>
-              <w:rPr>
-                <w:rFonts w:ascii="Calibri" w:cs="Calibri" w:eastAsia="Calibri" w:hAnsi="Calibri"/>
-                <w:sz w:val="18"/>
-                <w:szCs w:val="18"/>
-              </w:rPr>
-              <w:t xml:space="preserve">640+</w:t>
-            </w:r>
-          </w:p>
-        </w:tc>
-        <w:tc>
-          <w:tcPr>
-            <w:tcW w:type="dxa" w:w="1236"/>
-            <w:tcMar>
-              <w:top w:type="dxa" w:w="60"/>
-              <w:left w:type="dxa" w:w="100"/>
-              <w:bottom w:type="dxa" w:w="60"/>
-              <w:right w:type="dxa" w:w="100"/>
-            </w:tcMar>
-          </w:tcPr>
-          <w:p>
-            <w:pPr>
-              <w:spacing w:after="0"/>
-              <w:jc w:val="right"/>
-            </w:pPr>
-            <w:r>
-              <w:rPr>
-                <w:rFonts w:ascii="Calibri" w:cs="Calibri" w:eastAsia="Calibri" w:hAnsi="Calibri"/>
-                <w:sz w:val="18"/>
-                <w:szCs w:val="18"/>
-              </w:rPr>
-              <w:t xml:space="preserve">2018–20</w:t>
-            </w:r>
-          </w:p>
-        </w:tc>
-        <w:tc>
-          <w:tcPr>
-            <w:tcW w:type="dxa" w:w="1234"/>
-            <w:tcMar>
-              <w:top w:type="dxa" w:w="60"/>
-              <w:left w:type="dxa" w:w="100"/>
-              <w:bottom w:type="dxa" w:w="60"/>
-              <w:right w:type="dxa" w:w="100"/>
-            </w:tcMar>
-          </w:tcPr>
-          <w:p>
-            <w:pPr>
-              <w:spacing w:after="0"/>
-              <w:jc w:val="right"/>
-            </w:pPr>
-            <w:r>
-              <w:rPr>
-                <w:rFonts w:ascii="Calibri" w:cs="Calibri" w:eastAsia="Calibri" w:hAnsi="Calibri"/>
-                <w:sz w:val="18"/>
-                <w:szCs w:val="18"/>
-              </w:rPr>
-              <w:t xml:space="preserve">$143M reported (~$210K+/unit blended)</w:t>
-            </w:r>
-          </w:p>
-        </w:tc>
-      </w:tr>
-      <w:tr>
-        <w:trPr>
-          <w:tblHeader w:val="false"/>
-        </w:trPr>
-        <w:tc>
-          <w:tcPr>
-            <w:tcW w:type="dxa" w:w="3182"/>
-            <w:tcMar>
-              <w:top w:type="dxa" w:w="60"/>
-              <w:left w:type="dxa" w:w="100"/>
-              <w:bottom w:type="dxa" w:w="60"/>
-              <w:right w:type="dxa" w:w="100"/>
-            </w:tcMar>
-          </w:tcPr>
-          <w:p>
-            <w:pPr>
-              <w:spacing w:after="0"/>
-              <w:jc w:val="left"/>
-            </w:pPr>
-            <w:r>
-              <w:rPr>
-                <w:rFonts w:ascii="Calibri" w:cs="Calibri" w:eastAsia="Calibri" w:hAnsi="Calibri"/>
-                <w:sz w:val="18"/>
-                <w:szCs w:val="18"/>
-              </w:rPr>
-              <w:t xml:space="preserve">Jan 2022</w:t>
-            </w:r>
-          </w:p>
-        </w:tc>
-        <w:tc>
-          <w:tcPr>
-            <w:tcW w:type="dxa" w:w="1236"/>
-            <w:tcMar>
-              <w:top w:type="dxa" w:w="60"/>
-              <w:left w:type="dxa" w:w="100"/>
-              <w:bottom w:type="dxa" w:w="60"/>
-              <w:right w:type="dxa" w:w="100"/>
-            </w:tcMar>
-          </w:tcPr>
-          <w:p>
-            <w:pPr>
-              <w:spacing w:after="0"/>
-              <w:jc w:val="right"/>
-            </w:pPr>
-            <w:r>
-              <w:rPr>
-                <w:rFonts w:ascii="Calibri" w:cs="Calibri" w:eastAsia="Calibri" w:hAnsi="Calibri"/>
-                <w:sz w:val="18"/>
-                <w:szCs w:val="18"/>
-              </w:rPr>
-              <w:t xml:space="preserve">Prelude at Paramount</w:t>
-            </w:r>
-          </w:p>
-        </w:tc>
-        <w:tc>
-          <w:tcPr>
-            <w:tcW w:type="dxa" w:w="1236"/>
-            <w:tcMar>
-              <w:top w:type="dxa" w:w="60"/>
-              <w:left w:type="dxa" w:w="100"/>
-              <w:bottom w:type="dxa" w:w="60"/>
-              <w:right w:type="dxa" w:w="100"/>
-            </w:tcMar>
-          </w:tcPr>
-          <w:p>
-            <w:pPr>
-              <w:spacing w:after="0"/>
-              <w:jc w:val="right"/>
-            </w:pPr>
-            <w:r>
-              <w:rPr>
-                <w:rFonts w:ascii="Calibri" w:cs="Calibri" w:eastAsia="Calibri" w:hAnsi="Calibri"/>
-                <w:sz w:val="18"/>
-                <w:szCs w:val="18"/>
-              </w:rPr>
-              <w:t xml:space="preserve">Meridian</w:t>
-            </w:r>
-          </w:p>
-        </w:tc>
-        <w:tc>
-          <w:tcPr>
-            <w:tcW w:type="dxa" w:w="1236"/>
-            <w:tcMar>
-              <w:top w:type="dxa" w:w="60"/>
-              <w:left w:type="dxa" w:w="100"/>
-              <w:bottom w:type="dxa" w:w="60"/>
-              <w:right w:type="dxa" w:w="100"/>
-            </w:tcMar>
-          </w:tcPr>
-          <w:p>
-            <w:pPr>
-              <w:spacing w:after="0"/>
-              <w:jc w:val="right"/>
-            </w:pPr>
-            <w:r>
-              <w:rPr>
-                <w:rFonts w:ascii="Calibri" w:cs="Calibri" w:eastAsia="Calibri" w:hAnsi="Calibri"/>
-                <w:sz w:val="18"/>
-                <w:szCs w:val="18"/>
-              </w:rPr>
-              <w:t xml:space="preserve">280</w:t>
-            </w:r>
-          </w:p>
-        </w:tc>
-        <w:tc>
-          <w:tcPr>
-            <w:tcW w:type="dxa" w:w="1236"/>
-            <w:tcMar>
-              <w:top w:type="dxa" w:w="60"/>
-              <w:left w:type="dxa" w:w="100"/>
-              <w:bottom w:type="dxa" w:w="60"/>
-              <w:right w:type="dxa" w:w="100"/>
-            </w:tcMar>
-          </w:tcPr>
-          <w:p>
-            <w:pPr>
-              <w:spacing w:after="0"/>
-              <w:jc w:val="right"/>
-            </w:pPr>
-            <w:r>
-              <w:rPr>
-                <w:rFonts w:ascii="Calibri" w:cs="Calibri" w:eastAsia="Calibri" w:hAnsi="Calibri"/>
-                <w:sz w:val="18"/>
-                <w:szCs w:val="18"/>
-              </w:rPr>
-              <w:t xml:space="preserve">2018/19</w:t>
-            </w:r>
-          </w:p>
-        </w:tc>
-        <w:tc>
-          <w:tcPr>
-            <w:tcW w:type="dxa" w:w="1234"/>
-            <w:tcMar>
-              <w:top w:type="dxa" w:w="60"/>
-              <w:left w:type="dxa" w:w="100"/>
-              <w:bottom w:type="dxa" w:w="60"/>
-              <w:right w:type="dxa" w:w="100"/>
-            </w:tcMar>
-          </w:tcPr>
-          <w:p>
-            <w:pPr>
-              <w:spacing w:after="0"/>
-              <w:jc w:val="right"/>
-            </w:pPr>
-            <w:r>
-              <w:rPr>
-                <w:rFonts w:ascii="Calibri" w:cs="Calibri" w:eastAsia="Calibri" w:hAnsi="Calibri"/>
-                <w:sz w:val="18"/>
-                <w:szCs w:val="18"/>
-              </w:rPr>
-              <w:t xml:space="preserve">Pacific Development Partners ← Brighton/Pacific Partners (IPA)</w:t>
-            </w:r>
-          </w:p>
-        </w:tc>
-      </w:tr>
-      <w:tr>
-        <w:trPr>
-          <w:tblHeader w:val="false"/>
-        </w:trPr>
-        <w:tc>
-          <w:tcPr>
-            <w:tcW w:type="dxa" w:w="3182"/>
-            <w:tcMar>
-              <w:top w:type="dxa" w:w="60"/>
-              <w:left w:type="dxa" w:w="100"/>
-              <w:bottom w:type="dxa" w:w="60"/>
-              <w:right w:type="dxa" w:w="100"/>
-            </w:tcMar>
-          </w:tcPr>
-          <w:p>
-            <w:pPr>
-              <w:spacing w:after="0"/>
-              <w:jc w:val="left"/>
-            </w:pPr>
-            <w:r>
-              <w:rPr>
-                <w:rFonts w:ascii="Calibri" w:cs="Calibri" w:eastAsia="Calibri" w:hAnsi="Calibri"/>
-                <w:sz w:val="18"/>
-                <w:szCs w:val="18"/>
-              </w:rPr>
-              <w:t xml:space="preserve">Jun 2022</w:t>
-            </w:r>
-          </w:p>
-        </w:tc>
-        <w:tc>
-          <w:tcPr>
-            <w:tcW w:type="dxa" w:w="1236"/>
-            <w:tcMar>
-              <w:top w:type="dxa" w:w="60"/>
-              <w:left w:type="dxa" w:w="100"/>
-              <w:bottom w:type="dxa" w:w="60"/>
-              <w:right w:type="dxa" w:w="100"/>
-            </w:tcMar>
-          </w:tcPr>
-          <w:p>
-            <w:pPr>
-              <w:spacing w:after="0"/>
-              <w:jc w:val="right"/>
-            </w:pPr>
-            <w:r>
-              <w:rPr>
-                <w:rFonts w:ascii="Calibri" w:cs="Calibri" w:eastAsia="Calibri" w:hAnsi="Calibri"/>
-                <w:sz w:val="18"/>
-                <w:szCs w:val="18"/>
-              </w:rPr>
-              <w:t xml:space="preserve">The Addison + Franklin at Ten Mile</w:t>
-            </w:r>
-          </w:p>
-        </w:tc>
-        <w:tc>
-          <w:tcPr>
-            <w:tcW w:type="dxa" w:w="1236"/>
-            <w:tcMar>
-              <w:top w:type="dxa" w:w="60"/>
-              <w:left w:type="dxa" w:w="100"/>
-              <w:bottom w:type="dxa" w:w="60"/>
-              <w:right w:type="dxa" w:w="100"/>
-            </w:tcMar>
-          </w:tcPr>
-          <w:p>
-            <w:pPr>
-              <w:spacing w:after="0"/>
-              <w:jc w:val="right"/>
-            </w:pPr>
-            <w:r>
-              <w:rPr>
-                <w:rFonts w:ascii="Calibri" w:cs="Calibri" w:eastAsia="Calibri" w:hAnsi="Calibri"/>
-                <w:sz w:val="18"/>
-                <w:szCs w:val="18"/>
-              </w:rPr>
-              <w:t xml:space="preserve">Boise + Meridian</w:t>
-            </w:r>
-          </w:p>
-        </w:tc>
-        <w:tc>
-          <w:tcPr>
-            <w:tcW w:type="dxa" w:w="1236"/>
-            <w:tcMar>
-              <w:top w:type="dxa" w:w="60"/>
-              <w:left w:type="dxa" w:w="100"/>
-              <w:bottom w:type="dxa" w:w="60"/>
-              <w:right w:type="dxa" w:w="100"/>
-            </w:tcMar>
-          </w:tcPr>
-          <w:p>
-            <w:pPr>
-              <w:spacing w:after="0"/>
-              <w:jc w:val="right"/>
-            </w:pPr>
-            <w:r>
-              <w:rPr>
-                <w:rFonts w:ascii="Calibri" w:cs="Calibri" w:eastAsia="Calibri" w:hAnsi="Calibri"/>
-                <w:sz w:val="18"/>
-                <w:szCs w:val="18"/>
-              </w:rPr>
-              <w:t xml:space="preserve">605</w:t>
-            </w:r>
-          </w:p>
-        </w:tc>
-        <w:tc>
-          <w:tcPr>
-            <w:tcW w:type="dxa" w:w="1236"/>
-            <w:tcMar>
-              <w:top w:type="dxa" w:w="60"/>
-              <w:left w:type="dxa" w:w="100"/>
-              <w:bottom w:type="dxa" w:w="60"/>
-              <w:right w:type="dxa" w:w="100"/>
-            </w:tcMar>
-          </w:tcPr>
-          <w:p>
-            <w:pPr>
-              <w:spacing w:after="0"/>
-              <w:jc w:val="right"/>
-            </w:pPr>
-            <w:r>
-              <w:rPr>
-                <w:rFonts w:ascii="Calibri" w:cs="Calibri" w:eastAsia="Calibri" w:hAnsi="Calibri"/>
-                <w:sz w:val="18"/>
-                <w:szCs w:val="18"/>
-              </w:rPr>
-              <w:t xml:space="preserve">&lt;5 yrs old</w:t>
-            </w:r>
-          </w:p>
-        </w:tc>
-        <w:tc>
-          <w:tcPr>
-            <w:tcW w:type="dxa" w:w="1234"/>
-            <w:tcMar>
-              <w:top w:type="dxa" w:w="60"/>
-              <w:left w:type="dxa" w:w="100"/>
-              <w:bottom w:type="dxa" w:w="60"/>
-              <w:right w:type="dxa" w:w="100"/>
-            </w:tcMar>
-          </w:tcPr>
-          <w:p>
-            <w:pPr>
-              <w:spacing w:after="0"/>
-              <w:jc w:val="right"/>
-            </w:pPr>
-            <w:r>
-              <w:rPr>
-                <w:rFonts w:ascii="Calibri" w:cs="Calibri" w:eastAsia="Calibri" w:hAnsi="Calibri"/>
-                <w:sz w:val="18"/>
-                <w:szCs w:val="18"/>
-              </w:rPr>
-              <w:t xml:space="preserve">Cortland (buyer)</w:t>
-            </w:r>
-          </w:p>
-        </w:tc>
-      </w:tr>
-      <w:tr>
-        <w:trPr>
-          <w:tblHeader w:val="false"/>
-        </w:trPr>
-        <w:tc>
-          <w:tcPr>
-            <w:tcW w:type="dxa" w:w="3182"/>
-            <w:tcMar>
-              <w:top w:type="dxa" w:w="60"/>
-              <w:left w:type="dxa" w:w="100"/>
-              <w:bottom w:type="dxa" w:w="60"/>
-              <w:right w:type="dxa" w:w="100"/>
-            </w:tcMar>
-          </w:tcPr>
-          <w:p>
-            <w:pPr>
-              <w:spacing w:after="0"/>
-              <w:jc w:val="left"/>
-            </w:pPr>
-            <w:r>
-              <w:rPr>
-                <w:rFonts w:ascii="Calibri" w:cs="Calibri" w:eastAsia="Calibri" w:hAnsi="Calibri"/>
-                <w:sz w:val="18"/>
-                <w:szCs w:val="18"/>
-              </w:rPr>
-              <w:t xml:space="preserve">Dec 2024</w:t>
-            </w:r>
-          </w:p>
-        </w:tc>
-        <w:tc>
-          <w:tcPr>
-            <w:tcW w:type="dxa" w:w="1236"/>
-            <w:tcMar>
-              <w:top w:type="dxa" w:w="60"/>
-              <w:left w:type="dxa" w:w="100"/>
-              <w:bottom w:type="dxa" w:w="60"/>
-              <w:right w:type="dxa" w:w="100"/>
-            </w:tcMar>
-          </w:tcPr>
-          <w:p>
-            <w:pPr>
-              <w:spacing w:after="0"/>
-              <w:jc w:val="right"/>
-            </w:pPr>
-            <w:r>
-              <w:rPr>
-                <w:rFonts w:ascii="Calibri" w:cs="Calibri" w:eastAsia="Calibri" w:hAnsi="Calibri"/>
-                <w:sz w:val="18"/>
-                <w:szCs w:val="18"/>
-              </w:rPr>
-              <w:t xml:space="preserve">Verraso Village (BTR, avg 1,840 SF)</w:t>
-            </w:r>
-          </w:p>
-        </w:tc>
-        <w:tc>
-          <w:tcPr>
-            <w:tcW w:type="dxa" w:w="1236"/>
-            <w:tcMar>
-              <w:top w:type="dxa" w:w="60"/>
-              <w:left w:type="dxa" w:w="100"/>
-              <w:bottom w:type="dxa" w:w="60"/>
-              <w:right w:type="dxa" w:w="100"/>
-            </w:tcMar>
-          </w:tcPr>
-          <w:p>
-            <w:pPr>
-              <w:spacing w:after="0"/>
-              <w:jc w:val="right"/>
-            </w:pPr>
-            <w:r>
-              <w:rPr>
-                <w:rFonts w:ascii="Calibri" w:cs="Calibri" w:eastAsia="Calibri" w:hAnsi="Calibri"/>
-                <w:sz w:val="18"/>
-                <w:szCs w:val="18"/>
-              </w:rPr>
-              <w:t xml:space="preserve">Meridian</w:t>
-            </w:r>
-          </w:p>
-        </w:tc>
-        <w:tc>
-          <w:tcPr>
-            <w:tcW w:type="dxa" w:w="1236"/>
-            <w:tcMar>
-              <w:top w:type="dxa" w:w="60"/>
-              <w:left w:type="dxa" w:w="100"/>
-              <w:bottom w:type="dxa" w:w="60"/>
-              <w:right w:type="dxa" w:w="100"/>
-            </w:tcMar>
-          </w:tcPr>
-          <w:p>
-            <w:pPr>
-              <w:spacing w:after="0"/>
-              <w:jc w:val="right"/>
-            </w:pPr>
-            <w:r>
-              <w:rPr>
-                <w:rFonts w:ascii="Calibri" w:cs="Calibri" w:eastAsia="Calibri" w:hAnsi="Calibri"/>
-                <w:sz w:val="18"/>
-                <w:szCs w:val="18"/>
-              </w:rPr>
-              <w:t xml:space="preserve">96</w:t>
-            </w:r>
-          </w:p>
-        </w:tc>
-        <w:tc>
-          <w:tcPr>
-            <w:tcW w:type="dxa" w:w="1236"/>
-            <w:tcMar>
-              <w:top w:type="dxa" w:w="60"/>
-              <w:left w:type="dxa" w:w="100"/>
-              <w:bottom w:type="dxa" w:w="60"/>
-              <w:right w:type="dxa" w:w="100"/>
-            </w:tcMar>
-          </w:tcPr>
-          <w:p>
-            <w:pPr>
-              <w:spacing w:after="0"/>
-              <w:jc w:val="right"/>
-            </w:pPr>
-            <w:r>
-              <w:rPr>
-                <w:rFonts w:ascii="Calibri" w:cs="Calibri" w:eastAsia="Calibri" w:hAnsi="Calibri"/>
-                <w:sz w:val="18"/>
-                <w:szCs w:val="18"/>
-              </w:rPr>
-              <w:t xml:space="preserve">2016/18</w:t>
-            </w:r>
-          </w:p>
-        </w:tc>
-        <w:tc>
-          <w:tcPr>
-            <w:tcW w:type="dxa" w:w="1234"/>
-            <w:tcMar>
-              <w:top w:type="dxa" w:w="60"/>
-              <w:left w:type="dxa" w:w="100"/>
-              <w:bottom w:type="dxa" w:w="60"/>
-              <w:right w:type="dxa" w:w="100"/>
-            </w:tcMar>
-          </w:tcPr>
-          <w:p>
-            <w:pPr>
-              <w:spacing w:after="0"/>
-              <w:jc w:val="right"/>
-            </w:pPr>
-            <w:r>
-              <w:rPr>
-                <w:rFonts w:ascii="Calibri" w:cs="Calibri" w:eastAsia="Calibri" w:hAnsi="Calibri"/>
-                <w:sz w:val="18"/>
-                <w:szCs w:val="18"/>
-              </w:rPr>
-              <w:t xml:space="preserve">MJW ← undisclosed (3.2% assumable)</w:t>
-            </w:r>
-          </w:p>
-        </w:tc>
-      </w:tr>
-      <w:tr>
-        <w:trPr>
-          <w:tblHeader w:val="false"/>
-        </w:trPr>
-        <w:tc>
-          <w:tcPr>
-            <w:tcW w:type="dxa" w:w="3182"/>
-            <w:tcMar>
-              <w:top w:type="dxa" w:w="60"/>
-              <w:left w:type="dxa" w:w="100"/>
-              <w:bottom w:type="dxa" w:w="60"/>
-              <w:right w:type="dxa" w:w="100"/>
-            </w:tcMar>
-          </w:tcPr>
-          <w:p>
-            <w:pPr>
-              <w:spacing w:after="0"/>
-              <w:jc w:val="left"/>
-            </w:pPr>
-            <w:r>
-              <w:rPr>
-                <w:rFonts w:ascii="Calibri" w:cs="Calibri" w:eastAsia="Calibri" w:hAnsi="Calibri"/>
-                <w:sz w:val="18"/>
-                <w:szCs w:val="18"/>
-              </w:rPr>
-              <w:t xml:space="preserve">Dec 2025</w:t>
-            </w:r>
-          </w:p>
-        </w:tc>
-        <w:tc>
-          <w:tcPr>
-            <w:tcW w:type="dxa" w:w="1236"/>
-            <w:tcMar>
-              <w:top w:type="dxa" w:w="60"/>
-              <w:left w:type="dxa" w:w="100"/>
-              <w:bottom w:type="dxa" w:w="60"/>
-              <w:right w:type="dxa" w:w="100"/>
-            </w:tcMar>
-          </w:tcPr>
-          <w:p>
-            <w:pPr>
-              <w:spacing w:after="0"/>
-              <w:jc w:val="right"/>
-            </w:pPr>
-            <w:r>
-              <w:rPr>
-                <w:rFonts w:ascii="Calibri" w:cs="Calibri" w:eastAsia="Calibri" w:hAnsi="Calibri"/>
-                <w:sz w:val="18"/>
-                <w:szCs w:val="18"/>
-              </w:rPr>
-              <w:t xml:space="preserve">Prelude at Paramount</w:t>
-            </w:r>
-          </w:p>
-        </w:tc>
-        <w:tc>
-          <w:tcPr>
-            <w:tcW w:type="dxa" w:w="1236"/>
-            <w:tcMar>
-              <w:top w:type="dxa" w:w="60"/>
-              <w:left w:type="dxa" w:w="100"/>
-              <w:bottom w:type="dxa" w:w="60"/>
-              <w:right w:type="dxa" w:w="100"/>
-            </w:tcMar>
-          </w:tcPr>
-          <w:p>
-            <w:pPr>
-              <w:spacing w:after="0"/>
-              <w:jc w:val="right"/>
-            </w:pPr>
-            <w:r>
-              <w:rPr>
-                <w:rFonts w:ascii="Calibri" w:cs="Calibri" w:eastAsia="Calibri" w:hAnsi="Calibri"/>
-                <w:sz w:val="18"/>
-                <w:szCs w:val="18"/>
-              </w:rPr>
-              <w:t xml:space="preserve">Meridian</w:t>
-            </w:r>
-          </w:p>
-        </w:tc>
-        <w:tc>
-          <w:tcPr>
-            <w:tcW w:type="dxa" w:w="1236"/>
-            <w:tcMar>
-              <w:top w:type="dxa" w:w="60"/>
-              <w:left w:type="dxa" w:w="100"/>
-              <w:bottom w:type="dxa" w:w="60"/>
-              <w:right w:type="dxa" w:w="100"/>
-            </w:tcMar>
-          </w:tcPr>
-          <w:p>
-            <w:pPr>
-              <w:spacing w:after="0"/>
-              <w:jc w:val="right"/>
-            </w:pPr>
-            <w:r>
-              <w:rPr>
-                <w:rFonts w:ascii="Calibri" w:cs="Calibri" w:eastAsia="Calibri" w:hAnsi="Calibri"/>
-                <w:sz w:val="18"/>
-                <w:szCs w:val="18"/>
-              </w:rPr>
-              <w:t xml:space="preserve">280</w:t>
-            </w:r>
-          </w:p>
-        </w:tc>
-        <w:tc>
-          <w:tcPr>
-            <w:tcW w:type="dxa" w:w="1236"/>
-            <w:tcMar>
-              <w:top w:type="dxa" w:w="60"/>
-              <w:left w:type="dxa" w:w="100"/>
-              <w:bottom w:type="dxa" w:w="60"/>
-              <w:right w:type="dxa" w:w="100"/>
-            </w:tcMar>
-          </w:tcPr>
-          <w:p>
-            <w:pPr>
-              <w:spacing w:after="0"/>
-              <w:jc w:val="right"/>
-            </w:pPr>
-            <w:r>
-              <w:rPr>
-                <w:rFonts w:ascii="Calibri" w:cs="Calibri" w:eastAsia="Calibri" w:hAnsi="Calibri"/>
-                <w:sz w:val="18"/>
-                <w:szCs w:val="18"/>
-              </w:rPr>
-              <w:t xml:space="preserve">2018</w:t>
-            </w:r>
-          </w:p>
-        </w:tc>
-        <w:tc>
-          <w:tcPr>
-            <w:tcW w:type="dxa" w:w="1234"/>
-            <w:tcMar>
-              <w:top w:type="dxa" w:w="60"/>
-              <w:left w:type="dxa" w:w="100"/>
-              <w:bottom w:type="dxa" w:w="60"/>
-              <w:right w:type="dxa" w:w="100"/>
-            </w:tcMar>
-          </w:tcPr>
-          <w:p>
-            <w:pPr>
-              <w:spacing w:after="0"/>
-              <w:jc w:val="right"/>
-            </w:pPr>
-            <w:r>
-              <w:rPr>
-                <w:rFonts w:ascii="Calibri" w:cs="Calibri" w:eastAsia="Calibri" w:hAnsi="Calibri"/>
-                <w:sz w:val="18"/>
-                <w:szCs w:val="18"/>
-              </w:rPr>
-              <w:t xml:space="preserve">The Milestone Group ← Pacific Development Partners (IPA)</w:t>
-            </w:r>
-          </w:p>
-        </w:tc>
-      </w:tr>
-    </w:tbl>
-    <w:p>
-      <w:pPr>
-        <w:spacing w:after="80"/>
-      </w:pPr>
-    </w:p>
-    <w:p>
-      <w:pPr>
-        <w:spacing w:after="120" w:line="276"/>
-        <w:jc w:val="both"/>
-      </w:pPr>
-      <w:r>
-        <w:rPr>
-          <w:rFonts w:ascii="Calibri" w:cs="Calibri" w:eastAsia="Calibri" w:hAnsi="Calibri"/>
-          <w:sz w:val="21"/>
-          <w:szCs w:val="21"/>
-        </w:rPr>
-        <w:t xml:space="preserve">Milestone's own Prelude print — above $222K/unit for a 2018-vintage asset at ~1,016 SF average units — is fully consistent with this record and with the only reported-price 2020s trade ($205/SF): $222K/unit on Prelude is only ~$219/SF. </w:t>
-      </w:r>
-      <w:r>
-        <w:rPr>
-          <w:rFonts w:ascii="Calibri" w:cs="Calibri" w:eastAsia="Calibri" w:hAnsi="Calibri"/>
           <w:b/>
           <w:bCs/>
           <w:sz w:val="21"/>
           <w:szCs w:val="21"/>
         </w:rPr>
-        <w:t xml:space="preserve">The defensible clearing range for 150+ unit, 2020s-vintage Class A garden product in Ada County is approximately $250–340K/unit ($230–300/SF)</w:t>
-      </w:r>
-      <w:r>
-        <w:rPr>
-          <w:rFonts w:ascii="Calibri" w:cs="Calibri" w:eastAsia="Calibri" w:hAnsi="Calibri"/>
-          <w:sz w:val="21"/>
-          <w:szCs w:val="21"/>
-        </w:rPr>
-        <w:t xml:space="preserve">, with the Eagle/I-84 and Ten Mile nodes at the top of the band.</w:t>
-      </w:r>
-    </w:p>
-    <w:p>
-      <w:pPr>
-        <w:pStyle w:val="Heading2"/>
-        <w:spacing w:after="100" w:before="220"/>
-      </w:pPr>
-      <w:r>
-        <w:rPr>
-          <w:rFonts w:ascii="Georgia" w:cs="Georgia" w:eastAsia="Georgia" w:hAnsi="Georgia"/>
-          <w:b/>
-          <w:bCs/>
-          <w:color w:val="2E5E4E"/>
-          <w:sz w:val="25"/>
-          <w:szCs w:val="25"/>
-        </w:rPr>
-        <w:t xml:space="preserve">9.3 Replacement cost, rebuilt from local anchors</w:t>
-      </w:r>
-    </w:p>
-    <w:p>
-      <w:pPr>
-        <w:pStyle w:val="ListParagraph"/>
-        <w:numPr>
-          <w:ilvl w:val="0"/>
-          <w:numId w:val="2"/>
-        </w:numPr>
-        <w:spacing w:after="60"/>
-        <w:jc w:val="both"/>
-      </w:pPr>
-      <w:r>
-        <w:rPr>
-          <w:rFonts w:ascii="Calibri" w:cs="Calibri" w:eastAsia="Calibri" w:hAnsi="Calibri"/>
-          <w:b/>
-          <w:bCs/>
-          <w:sz w:val="21"/>
-          <w:szCs w:val="21"/>
-        </w:rPr>
-        <w:t xml:space="preserve">Seasons itself cost "$100 million-plus" for 360 units at January-2023 pricing — ≥$278K/unit</w:t>
-      </w:r>
-      <w:r>
-        <w:rPr>
-          <w:rFonts w:ascii="Calibri" w:cs="Calibri" w:eastAsia="Calibri" w:hAnsi="Calibri"/>
-          <w:sz w:val="21"/>
-          <w:szCs w:val="21"/>
-        </w:rPr>
-        <w:t xml:space="preserve"> (developer, via Multifamily Dive). Escalated at 3–5%/year, today's rebuild is </w:t>
-      </w:r>
-      <w:r>
-        <w:rPr>
-          <w:rFonts w:ascii="Calibri" w:cs="Calibri" w:eastAsia="Calibri" w:hAnsi="Calibri"/>
-          <w:b/>
-          <w:bCs/>
-          <w:sz w:val="21"/>
-          <w:szCs w:val="21"/>
-        </w:rPr>
-        <w:t xml:space="preserve">~$305–330K/unit</w:t>
-      </w:r>
-      <w:r>
-        <w:rPr>
-          <w:rFonts w:ascii="Calibri" w:cs="Calibri" w:eastAsia="Calibri" w:hAnsi="Calibri"/>
-          <w:sz w:val="21"/>
-          <w:szCs w:val="21"/>
-        </w:rPr>
-        <w:t xml:space="preserve">.</w:t>
-      </w:r>
-    </w:p>
-    <w:p>
-      <w:pPr>
-        <w:pStyle w:val="ListParagraph"/>
-        <w:numPr>
-          <w:ilvl w:val="0"/>
-          <w:numId w:val="2"/>
-        </w:numPr>
-        <w:spacing w:after="60"/>
-        <w:jc w:val="both"/>
-      </w:pPr>
-      <w:r>
-        <w:rPr>
-          <w:rFonts w:ascii="Calibri" w:cs="Calibri" w:eastAsia="Calibri" w:hAnsi="Calibri"/>
-          <w:sz w:val="21"/>
-          <w:szCs w:val="21"/>
-        </w:rPr>
-        <w:t xml:space="preserve">Village Apartments (336-unit, 4-story, Meridian): a </w:t>
-      </w:r>
-      <w:r>
-        <w:rPr>
-          <w:rFonts w:ascii="Calibri" w:cs="Calibri" w:eastAsia="Calibri" w:hAnsi="Calibri"/>
-          <w:b/>
-          <w:bCs/>
-          <w:sz w:val="21"/>
-          <w:szCs w:val="21"/>
-        </w:rPr>
-        <w:t xml:space="preserve">$202K/unit senior construction loan alone</w:t>
-      </w:r>
-      <w:r>
-        <w:rPr>
-          <w:rFonts w:ascii="Calibri" w:cs="Calibri" w:eastAsia="Calibri" w:hAnsi="Calibri"/>
-          <w:sz w:val="21"/>
-          <w:szCs w:val="21"/>
-        </w:rPr>
-        <w:t xml:space="preserve"> (2022); at 60–65% LTC → ~$300–335K/unit total cost.</w:t>
-      </w:r>
-    </w:p>
-    <w:p>
-      <w:pPr>
-        <w:pStyle w:val="ListParagraph"/>
-        <w:numPr>
-          <w:ilvl w:val="0"/>
-          <w:numId w:val="2"/>
-        </w:numPr>
-        <w:spacing w:after="60"/>
-        <w:jc w:val="both"/>
-      </w:pPr>
-      <w:r>
-        <w:rPr>
-          <w:rFonts w:ascii="Calibri" w:cs="Calibri" w:eastAsia="Calibri" w:hAnsi="Calibri"/>
-          <w:sz w:val="21"/>
-          <w:szCs w:val="21"/>
-        </w:rPr>
-        <w:t xml:space="preserve">Roundhouse (2023): building a Fowler-equivalent costs "100–125% more" than its 2015 bid.</w:t>
-      </w:r>
-    </w:p>
-    <w:p>
-      <w:pPr>
-        <w:pStyle w:val="ListParagraph"/>
-        <w:numPr>
-          <w:ilvl w:val="0"/>
-          <w:numId w:val="2"/>
-        </w:numPr>
-        <w:spacing w:after="60"/>
-        <w:jc w:val="both"/>
-      </w:pPr>
-      <w:r>
-        <w:rPr>
-          <w:rFonts w:ascii="Calibri" w:cs="Calibri" w:eastAsia="Calibri" w:hAnsi="Calibri"/>
-          <w:sz w:val="21"/>
-          <w:szCs w:val="21"/>
-        </w:rPr>
-        <w:t xml:space="preserve">Suburban Meridian MF land at Seasons density: ~$25–40K/unit; construction financing at ~7%.</w:t>
-      </w:r>
-    </w:p>
-    <w:p>
-      <w:pPr>
-        <w:spacing w:after="120" w:line="276"/>
-        <w:jc w:val="both"/>
-      </w:pPr>
-      <w:r>
-        <w:rPr>
-          <w:rFonts w:ascii="Calibri" w:cs="Calibri" w:eastAsia="Calibri" w:hAnsi="Calibri"/>
-          <w:b/>
-          <w:bCs/>
-          <w:sz w:val="21"/>
-          <w:szCs w:val="21"/>
-        </w:rPr>
-        <w:t xml:space="preserve">All-in for a Seasons-equivalent today: ~$300–340K/unit.</w:t>
-      </w:r>
-      <w:r>
-        <w:rPr>
-          <w:rFonts w:ascii="Calibri" w:cs="Calibri" w:eastAsia="Calibri" w:hAnsi="Calibri"/>
-          <w:sz w:val="21"/>
-          <w:szCs w:val="21"/>
-        </w:rPr>
-        <w:t xml:space="preserve"> A ~$328K/unit valuation is therefore </w:t>
-      </w:r>
-      <w:r>
-        <w:rPr>
-          <w:rFonts w:ascii="Calibri" w:cs="Calibri" w:eastAsia="Calibri" w:hAnsi="Calibri"/>
-          <w:b/>
-          <w:bCs/>
-          <w:sz w:val="21"/>
-          <w:szCs w:val="21"/>
-        </w:rPr>
-        <w:t xml:space="preserve">replacement-cost parity, not a premium to it</w:t>
-      </w:r>
-      <w:r>
-        <w:rPr>
-          <w:rFonts w:ascii="Calibri" w:cs="Calibri" w:eastAsia="Calibri" w:hAnsi="Calibri"/>
-          <w:sz w:val="21"/>
-          <w:szCs w:val="21"/>
-        </w:rPr>
-        <w:t xml:space="preserve"> — at the metro's most supply-protected node (per the location-premium memo: ~26 acres of by-right MF land within 1.5 miles, zero 10+ acre sites).</w:t>
-      </w:r>
-    </w:p>
-    <w:p>
-      <w:pPr>
-        <w:pStyle w:val="Heading2"/>
-        <w:spacing w:after="100" w:before="220"/>
-      </w:pPr>
-      <w:r>
-        <w:rPr>
-          <w:rFonts w:ascii="Georgia" w:cs="Georgia" w:eastAsia="Georgia" w:hAnsi="Georgia"/>
-          <w:b/>
-          <w:bCs/>
-          <w:color w:val="2E5E4E"/>
-          <w:sz w:val="25"/>
-          <w:szCs w:val="25"/>
-        </w:rPr>
-        <w:t xml:space="preserve">9.4 The development math stays broken — which is the thesis</w:t>
-      </w:r>
-    </w:p>
-    <w:p>
-      <w:pPr>
-        <w:spacing w:after="120" w:line="276"/>
-        <w:jc w:val="both"/>
-      </w:pPr>
-      <w:r>
-        <w:rPr>
-          <w:rFonts w:ascii="Calibri" w:cs="Calibri" w:eastAsia="Calibri" w:hAnsi="Calibri"/>
-          <w:sz w:val="21"/>
-          <w:szCs w:val="21"/>
-        </w:rPr>
-        <w:t xml:space="preserve">Against ~$320K/unit cost and a required ~6.0–6.5% yield-on-cost (vs a ~5.2% market cap), new construction needs ~$2,500–2,700/month blended rents versus ~$1,950–2,000 in place at Seasons — a </w:t>
-      </w:r>
-      <w:r>
-        <w:rPr>
-          <w:rFonts w:ascii="Calibri" w:cs="Calibri" w:eastAsia="Calibri" w:hAnsi="Calibri"/>
-          <w:b/>
-          <w:bCs/>
-          <w:sz w:val="21"/>
-          <w:szCs w:val="21"/>
-        </w:rPr>
-        <w:t xml:space="preserve">25–35% rent gap</w:t>
-      </w:r>
-      <w:r>
-        <w:rPr>
-          <w:rFonts w:ascii="Calibri" w:cs="Calibri" w:eastAsia="Calibri" w:hAnsi="Calibri"/>
-          <w:sz w:val="21"/>
-          <w:szCs w:val="21"/>
-        </w:rPr>
-        <w:t xml:space="preserve">. That is why metro completions fell 64% in 2025, under-construction inventory sits at 2–3.5% of stock, and Seasons' own entitled Phase 2 (351 units) remains parked in concept design. Local cap-rate context: TOK pegs Treasure Valley multifamily at ~5.2% (2025); at $328K/unit, a realistic Seasons NOI implies ~4.7–5.2% — inside the quoted Class A band.</w:t>
-      </w:r>
-    </w:p>
-    <w:p>
-      <w:pPr>
-        <w:spacing w:after="120" w:line="276"/>
-        <w:jc w:val="both"/>
-      </w:pPr>
-      <w:r>
-        <w:rPr>
-          <w:rFonts w:ascii="Calibri" w:cs="Calibri" w:eastAsia="Calibri" w:hAnsi="Calibri"/>
-          <w:b/>
-          <w:bCs/>
-          <w:sz w:val="21"/>
-          <w:szCs w:val="21"/>
-        </w:rPr>
-        <w:t xml:space="preserve">Corrected bottom line:</w:t>
-      </w:r>
-      <w:r>
-        <w:rPr>
-          <w:rFonts w:ascii="Calibri" w:cs="Calibri" w:eastAsia="Calibri" w:hAnsi="Calibri"/>
-          <w:sz w:val="21"/>
-          <w:szCs w:val="21"/>
-        </w:rPr>
-        <w:t xml:space="preserve"> the buyer at ~$328K/unit is not paying 30–60% over the market; they are paying approximately what the asset would cost to build, in a market where nobody can build (the rent gap), at the node where nobody could build even if the math worked (the land moat). The prior framing — "the premium must show up in rents because it will not show up in basis" — inverts: </w:t>
-      </w:r>
-      <w:r>
-        <w:rPr>
-          <w:rFonts w:ascii="Calibri" w:cs="Calibri" w:eastAsia="Calibri" w:hAnsi="Calibri"/>
-          <w:b/>
-          <w:bCs/>
-          <w:sz w:val="21"/>
-          <w:szCs w:val="21"/>
-        </w:rPr>
-        <w:t xml:space="preserve">basis at replacement parity plus a dead pipeline is the margin of safety</w:t>
-      </w:r>
-      <w:r>
-        <w:rPr>
-          <w:rFonts w:ascii="Calibri" w:cs="Calibri" w:eastAsia="Calibri" w:hAnsi="Calibri"/>
-          <w:sz w:val="21"/>
-          <w:szCs w:val="21"/>
-        </w:rPr>
-        <w:t xml:space="preserve">, and the employment findings of this paper (supply-constrained labor market, wage growth, artifact-depressed payroll prints, 2027–30 catalyst stack) support the demand side of that thesis.</w:t>
+        <w:t xml:space="preserve">Momentum:</w:t>
+      </w:r>
+      <w:r>
+        <w:rPr>
+          <w:rFonts w:ascii="Calibri" w:cs="Calibri" w:eastAsia="Calibri" w:hAnsi="Calibri"/>
+          <w:sz w:val="21"/>
+          <w:szCs w:val="21"/>
+        </w:rPr>
+        <w:t xml:space="preserve"> T3M level vs the T3M level six months earlier, annualized ((a/b)² − 1); NSA, therefore compared only against like halves of prior years.</w:t>
       </w:r>
     </w:p>
     <w:p>
@@ -9788,7 +8309,7 @@
           <w:sz w:val="32"/>
           <w:szCs w:val="32"/>
         </w:rPr>
-        <w:t xml:space="preserve">Appendix I: Methodology</w:t>
+        <w:t xml:space="preserve">Appendix II: Contested-Claims Register</w:t>
       </w:r>
     </w:p>
     <w:p>
@@ -9799,20 +8320,28 @@
       <w:r>
         <w:rPr>
           <w:rFonts w:ascii="Calibri" w:cs="Calibri" w:eastAsia="Calibri" w:hAnsi="Calibri"/>
+          <w:sz w:val="21"/>
+          <w:szCs w:val="21"/>
+        </w:rPr>
+        <w:t xml:space="preserve">1. </w:t>
+      </w:r>
+      <w:r>
+        <w:rPr>
+          <w:rFonts w:ascii="Calibri" w:cs="Calibri" w:eastAsia="Calibri" w:hAnsi="Calibri"/>
           <w:b/>
           <w:bCs/>
           <w:sz w:val="21"/>
           <w:szCs w:val="21"/>
         </w:rPr>
-        <w:t xml:space="preserve">T3M construction:</w:t>
-      </w:r>
-      <w:r>
-        <w:rPr>
-          <w:rFonts w:ascii="Calibri" w:cs="Calibri" w:eastAsia="Calibri" w:hAnsi="Calibri"/>
-          <w:sz w:val="21"/>
-          <w:szCs w:val="21"/>
-        </w:rPr>
-        <w:t xml:space="preserve"> 3-month arithmetic mean of NSA CES employment ending in the stated month, compared to the identical window one year prior. Sources: BLS SM flat files (`sm.data.13.Idaho`, `sm.data.54.TotalNonFarm.All`), series IDs in `appendix/E` of the deal file; US comparisons from FRED (PAYNSA and SA supersector series for shift-share).</w:t>
+        <w:t xml:space="preserve">AI displacement magnitude</w:t>
+      </w:r>
+      <w:r>
+        <w:rPr>
+          <w:rFonts w:ascii="Calibri" w:cs="Calibri" w:eastAsia="Calibri" w:hAnsi="Calibri"/>
+          <w:sz w:val="21"/>
+          <w:szCs w:val="21"/>
+        </w:rPr>
+        <w:t xml:space="preserve"> — occupation-level effects credible (Stanford/ADP); aggregate effect unproven (Yale Budget Lab finds none). No payroll attribution assigned.</w:t>
       </w:r>
     </w:p>
     <w:p>
@@ -9823,20 +8352,28 @@
       <w:r>
         <w:rPr>
           <w:rFonts w:ascii="Calibri" w:cs="Calibri" w:eastAsia="Calibri" w:hAnsi="Calibri"/>
+          <w:sz w:val="21"/>
+          <w:szCs w:val="21"/>
+        </w:rPr>
+        <w:t xml:space="preserve">2. </w:t>
+      </w:r>
+      <w:r>
+        <w:rPr>
+          <w:rFonts w:ascii="Calibri" w:cs="Calibri" w:eastAsia="Calibri" w:hAnsi="Calibri"/>
           <w:b/>
           <w:bCs/>
           <w:sz w:val="21"/>
           <w:szCs w:val="21"/>
         </w:rPr>
-        <w:t xml:space="preserve">Shift-share:</w:t>
-      </w:r>
-      <w:r>
-        <w:rPr>
-          <w:rFonts w:ascii="Calibri" w:cs="Calibri" w:eastAsia="Calibri" w:hAnsi="Calibri"/>
-          <w:sz w:val="21"/>
-          <w:szCs w:val="21"/>
-        </w:rPr>
-        <w:t xml:space="preserve"> expected sector change = Boise sector base employment (prior-year T3M) × national sector T3M YoY growth; local residual = actual − expected. National sector rates use SA series (YoY comparisons are insensitive to seasonal adjustment).</w:t>
+        <w:t xml:space="preserve">Tariff job-loss attribution</w:t>
+      </w:r>
+      <w:r>
+        <w:rPr>
+          <w:rFonts w:ascii="Calibri" w:cs="Calibri" w:eastAsia="Calibri" w:hAnsi="Calibri"/>
+          <w:sz w:val="21"/>
+          <w:szCs w:val="21"/>
+        </w:rPr>
+        <w:t xml:space="preserve"> — direction (negative-to-zero for manufacturing) is consensus; magnitude contested (CAP −89K vs Cato/AEI near-zero).</w:t>
       </w:r>
     </w:p>
     <w:p>
@@ -9847,20 +8384,28 @@
       <w:r>
         <w:rPr>
           <w:rFonts w:ascii="Calibri" w:cs="Calibri" w:eastAsia="Calibri" w:hAnsi="Calibri"/>
+          <w:sz w:val="21"/>
+          <w:szCs w:val="21"/>
+        </w:rPr>
+        <w:t xml:space="preserve">3. </w:t>
+      </w:r>
+      <w:r>
+        <w:rPr>
+          <w:rFonts w:ascii="Calibri" w:cs="Calibri" w:eastAsia="Calibri" w:hAnsi="Calibri"/>
           <w:b/>
           <w:bCs/>
           <w:sz w:val="21"/>
           <w:szCs w:val="21"/>
         </w:rPr>
-        <w:t xml:space="preserve">QCEW:</w:t>
-      </w:r>
-      <w:r>
-        <w:rPr>
-          <w:rFonts w:ascii="Calibri" w:cs="Calibri" w:eastAsia="Calibri" w:hAnsi="Calibri"/>
-          <w:sz w:val="21"/>
-          <w:szCs w:val="21"/>
-        </w:rPr>
-        <w:t xml:space="preserve"> BLS QCEW open-data API, county area files (16001 Ada, 16027 Canyon), total covered employment = own_code 0 / industry 10, quarterly average of the three monthly employment levels; sector rows own_code 5 (private), 2-digit NAICS. Q4 2025 is the latest available quarter (published June 2026); Q1 2026 publishes ~September 2026.</w:t>
+        <w:t xml:space="preserve">2025 net migration level</w:t>
+      </w:r>
+      <w:r>
+        <w:rPr>
+          <w:rFonts w:ascii="Calibri" w:cs="Calibri" w:eastAsia="Calibri" w:hAnsi="Calibri"/>
+          <w:sz w:val="21"/>
+          <w:szCs w:val="21"/>
+        </w:rPr>
+        <w:t xml:space="preserve"> — Brookings (−295K to −10K) vs CBO (+400K); enforcement-driven voluntary exit is the swing variable.</w:t>
       </w:r>
     </w:p>
     <w:p>
@@ -9871,20 +8416,28 @@
       <w:r>
         <w:rPr>
           <w:rFonts w:ascii="Calibri" w:cs="Calibri" w:eastAsia="Calibri" w:hAnsi="Calibri"/>
+          <w:sz w:val="21"/>
+          <w:szCs w:val="21"/>
+        </w:rPr>
+        <w:t xml:space="preserve">4. </w:t>
+      </w:r>
+      <w:r>
+        <w:rPr>
+          <w:rFonts w:ascii="Calibri" w:cs="Calibri" w:eastAsia="Calibri" w:hAnsi="Calibri"/>
           <w:b/>
           <w:bCs/>
           <w:sz w:val="21"/>
           <w:szCs w:val="21"/>
         </w:rPr>
-        <w:t xml:space="preserve">Household employment:</w:t>
-      </w:r>
-      <w:r>
-        <w:rPr>
-          <w:rFonts w:ascii="Calibri" w:cs="Calibri" w:eastAsia="Calibri" w:hAnsi="Calibri"/>
-          <w:sz w:val="21"/>
-          <w:szCs w:val="21"/>
-        </w:rPr>
-        <w:t xml:space="preserve"> derived as labor force × (1 − unemployment rate) from FRED BOIS216LFN and BOIS216URN (LAUS). October 2025 is missing from the source series (shutdown-period gap).</w:t>
+        <w:t xml:space="preserve">Supply vs demand shares of the national stall</w:t>
+      </w:r>
+      <w:r>
+        <w:rPr>
+          <w:rFonts w:ascii="Calibri" w:cs="Calibri" w:eastAsia="Calibri" w:hAnsi="Calibri"/>
+          <w:sz w:val="21"/>
+          <w:szCs w:val="21"/>
+        </w:rPr>
+        <w:t xml:space="preserve"> — Fed/Goldman lean supply; COVID-low hires rate argues meaningful demand weakness. Treated as joint.</w:t>
       </w:r>
     </w:p>
     <w:p>
@@ -9895,20 +8448,60 @@
       <w:r>
         <w:rPr>
           <w:rFonts w:ascii="Calibri" w:cs="Calibri" w:eastAsia="Calibri" w:hAnsi="Calibri"/>
+          <w:sz w:val="21"/>
+          <w:szCs w:val="21"/>
+        </w:rPr>
+        <w:t xml:space="preserve">5. </w:t>
+      </w:r>
+      <w:r>
+        <w:rPr>
+          <w:rFonts w:ascii="Calibri" w:cs="Calibri" w:eastAsia="Calibri" w:hAnsi="Calibri"/>
           <w:b/>
           <w:bCs/>
           <w:sz w:val="21"/>
           <w:szCs w:val="21"/>
         </w:rPr>
-        <w:t xml:space="preserve">Momentum:</w:t>
-      </w:r>
-      <w:r>
-        <w:rPr>
-          <w:rFonts w:ascii="Calibri" w:cs="Calibri" w:eastAsia="Calibri" w:hAnsi="Calibri"/>
-          <w:sz w:val="21"/>
-          <w:szCs w:val="21"/>
-        </w:rPr>
-        <w:t xml:space="preserve"> T3M level vs the T3M level six months earlier, annualized ((a/b)² − 1); NSA, therefore compared only against like halves of prior years.</w:t>
+        <w:t xml:space="preserve">Boise QCEW-CES divergence</w:t>
+      </w:r>
+      <w:r>
+        <w:rPr>
+          <w:rFonts w:ascii="Calibri" w:cs="Calibri" w:eastAsia="Calibri" w:hAnsi="Calibri"/>
+          <w:sz w:val="21"/>
+          <w:szCs w:val="21"/>
+        </w:rPr>
+        <w:t xml:space="preserve"> — our artifact finding rests on preliminary Q4 2025 QCEW; it reverses only if QCEW revisions are unusually large or Q1–Q2 2026 QCEW confirms the CES cliff.</w:t>
+      </w:r>
+    </w:p>
+    <w:p>
+      <w:pPr>
+        <w:spacing w:after="120" w:line="276"/>
+        <w:jc w:val="both"/>
+      </w:pPr>
+      <w:r>
+        <w:rPr>
+          <w:rFonts w:ascii="Calibri" w:cs="Calibri" w:eastAsia="Calibri" w:hAnsi="Calibri"/>
+          <w:sz w:val="21"/>
+          <w:szCs w:val="21"/>
+        </w:rPr>
+        <w:t xml:space="preserve">6. </w:t>
+      </w:r>
+      <w:r>
+        <w:rPr>
+          <w:rFonts w:ascii="Calibri" w:cs="Calibri" w:eastAsia="Calibri" w:hAnsi="Calibri"/>
+          <w:b/>
+          <w:bCs/>
+          <w:sz w:val="21"/>
+          <w:szCs w:val="21"/>
+        </w:rPr>
+        <w:t xml:space="preserve">Micron site headcount post-Exyte</w:t>
+      </w:r>
+      <w:r>
+        <w:rPr>
+          <w:rFonts w:ascii="Calibri" w:cs="Calibri" w:eastAsia="Calibri" w:hAnsi="Calibri"/>
+          <w:sz w:val="21"/>
+          <w:szCs w:val="21"/>
+        </w:rPr>
+        <w:t xml:space="preserve"> — termination and 200+ layoffs documented; net site construction employment change not public.</w:t>
       </w:r>
     </w:p>
     <w:p>
@@ -9926,7 +8519,7 @@
           <w:sz w:val="32"/>
           <w:szCs w:val="32"/>
         </w:rPr>
-        <w:t xml:space="preserve">Appendix II: Contested-Claims Register</w:t>
+        <w:t xml:space="preserve">Appendix III: Evidence Gaps</w:t>
       </w:r>
     </w:p>
     <w:p>
@@ -9940,25 +8533,7 @@
           <w:sz w:val="21"/>
           <w:szCs w:val="21"/>
         </w:rPr>
-        <w:t xml:space="preserve">1. </w:t>
-      </w:r>
-      <w:r>
-        <w:rPr>
-          <w:rFonts w:ascii="Calibri" w:cs="Calibri" w:eastAsia="Calibri" w:hAnsi="Calibri"/>
-          <w:b/>
-          <w:bCs/>
-          <w:sz w:val="21"/>
-          <w:szCs w:val="21"/>
-        </w:rPr>
-        <w:t xml:space="preserve">AI displacement magnitude</w:t>
-      </w:r>
-      <w:r>
-        <w:rPr>
-          <w:rFonts w:ascii="Calibri" w:cs="Calibri" w:eastAsia="Calibri" w:hAnsi="Calibri"/>
-          <w:sz w:val="21"/>
-          <w:szCs w:val="21"/>
-        </w:rPr>
-        <w:t xml:space="preserve"> — occupation-level effects credible (Stanford/ADP); aggregate effect unproven (Yale Budget Lab finds none). No payroll attribution assigned.</w:t>
+        <w:t xml:space="preserve">1. Boise hotel occupancy/RevPAR 2025–26 (STR data needed).</w:t>
       </w:r>
     </w:p>
     <w:p>
@@ -9972,25 +8547,7 @@
           <w:sz w:val="21"/>
           <w:szCs w:val="21"/>
         </w:rPr>
-        <w:t xml:space="preserve">2. </w:t>
-      </w:r>
-      <w:r>
-        <w:rPr>
-          <w:rFonts w:ascii="Calibri" w:cs="Calibri" w:eastAsia="Calibri" w:hAnsi="Calibri"/>
-          <w:b/>
-          <w:bCs/>
-          <w:sz w:val="21"/>
-          <w:szCs w:val="21"/>
-        </w:rPr>
-        <w:t xml:space="preserve">Tariff job-loss attribution</w:t>
-      </w:r>
-      <w:r>
-        <w:rPr>
-          <w:rFonts w:ascii="Calibri" w:cs="Calibri" w:eastAsia="Calibri" w:hAnsi="Calibri"/>
-          <w:sz w:val="21"/>
-          <w:szCs w:val="21"/>
-        </w:rPr>
-        <w:t xml:space="preserve"> — direction (negative-to-zero for manufacturing) is consensus; magnitude contested (CAP −89K vs Cato/AEI near-zero).</w:t>
+        <w:t xml:space="preserve">2. Ada–Canyon building-permit counts for 2025–H1 2026 (COMPASS/Census BPS pull recommended).</w:t>
       </w:r>
     </w:p>
     <w:p>
@@ -10004,25 +8561,7 @@
           <w:sz w:val="21"/>
           <w:szCs w:val="21"/>
         </w:rPr>
-        <w:t xml:space="preserve">3. </w:t>
-      </w:r>
-      <w:r>
-        <w:rPr>
-          <w:rFonts w:ascii="Calibri" w:cs="Calibri" w:eastAsia="Calibri" w:hAnsi="Calibri"/>
-          <w:b/>
-          <w:bCs/>
-          <w:sz w:val="21"/>
-          <w:szCs w:val="21"/>
-        </w:rPr>
-        <w:t xml:space="preserve">2025 net migration level</w:t>
-      </w:r>
-      <w:r>
-        <w:rPr>
-          <w:rFonts w:ascii="Calibri" w:cs="Calibri" w:eastAsia="Calibri" w:hAnsi="Calibri"/>
-          <w:sz w:val="21"/>
-          <w:szCs w:val="21"/>
-        </w:rPr>
-        <w:t xml:space="preserve"> — Brookings (−295K to −10K) vs CBO (+400K); enforcement-driven voluntary exit is the swing variable.</w:t>
+        <w:t xml:space="preserve">3. Formal hospital-system hiring-policy statements (none public; visible only in aggregate data).</w:t>
       </w:r>
     </w:p>
     <w:p>
@@ -10036,25 +8575,7 @@
           <w:sz w:val="21"/>
           <w:szCs w:val="21"/>
         </w:rPr>
-        <w:t xml:space="preserve">4. </w:t>
-      </w:r>
-      <w:r>
-        <w:rPr>
-          <w:rFonts w:ascii="Calibri" w:cs="Calibri" w:eastAsia="Calibri" w:hAnsi="Calibri"/>
-          <w:b/>
-          <w:bCs/>
-          <w:sz w:val="21"/>
-          <w:szCs w:val="21"/>
-        </w:rPr>
-        <w:t xml:space="preserve">Supply vs demand shares of the national stall</w:t>
-      </w:r>
-      <w:r>
-        <w:rPr>
-          <w:rFonts w:ascii="Calibri" w:cs="Calibri" w:eastAsia="Calibri" w:hAnsi="Calibri"/>
-          <w:sz w:val="21"/>
-          <w:szCs w:val="21"/>
-        </w:rPr>
-        <w:t xml:space="preserve"> — Fed/Goldman lean supply; COVID-low hires rate argues meaningful demand weakness. Treated as joint.</w:t>
+        <w:t xml:space="preserve">4. Quantified immigration-enforcement employment effects for the Boise MSA.</w:t>
       </w:r>
     </w:p>
     <w:p>
@@ -10068,159 +8589,7 @@
           <w:sz w:val="21"/>
           <w:szCs w:val="21"/>
         </w:rPr>
-        <w:t xml:space="preserve">5. </w:t>
-      </w:r>
-      <w:r>
-        <w:rPr>
-          <w:rFonts w:ascii="Calibri" w:cs="Calibri" w:eastAsia="Calibri" w:hAnsi="Calibri"/>
-          <w:b/>
-          <w:bCs/>
-          <w:sz w:val="21"/>
-          <w:szCs w:val="21"/>
-        </w:rPr>
-        <w:t xml:space="preserve">Boise QCEW-CES divergence</w:t>
-      </w:r>
-      <w:r>
-        <w:rPr>
-          <w:rFonts w:ascii="Calibri" w:cs="Calibri" w:eastAsia="Calibri" w:hAnsi="Calibri"/>
-          <w:sz w:val="21"/>
-          <w:szCs w:val="21"/>
-        </w:rPr>
-        <w:t xml:space="preserve"> — our artifact finding rests on preliminary Q4 2025 QCEW; it reverses only if QCEW revisions are unusually large or Q1–Q2 2026 QCEW confirms the CES cliff.</w:t>
-      </w:r>
-    </w:p>
-    <w:p>
-      <w:pPr>
-        <w:spacing w:after="120" w:line="276"/>
-        <w:jc w:val="both"/>
-      </w:pPr>
-      <w:r>
-        <w:rPr>
-          <w:rFonts w:ascii="Calibri" w:cs="Calibri" w:eastAsia="Calibri" w:hAnsi="Calibri"/>
-          <w:sz w:val="21"/>
-          <w:szCs w:val="21"/>
-        </w:rPr>
-        <w:t xml:space="preserve">6. </w:t>
-      </w:r>
-      <w:r>
-        <w:rPr>
-          <w:rFonts w:ascii="Calibri" w:cs="Calibri" w:eastAsia="Calibri" w:hAnsi="Calibri"/>
-          <w:b/>
-          <w:bCs/>
-          <w:sz w:val="21"/>
-          <w:szCs w:val="21"/>
-        </w:rPr>
-        <w:t xml:space="preserve">Micron site headcount post-Exyte</w:t>
-      </w:r>
-      <w:r>
-        <w:rPr>
-          <w:rFonts w:ascii="Calibri" w:cs="Calibri" w:eastAsia="Calibri" w:hAnsi="Calibri"/>
-          <w:sz w:val="21"/>
-          <w:szCs w:val="21"/>
-        </w:rPr>
-        <w:t xml:space="preserve"> — termination and 200+ layoffs documented; net site construction employment change not public.</w:t>
-      </w:r>
-    </w:p>
-    <w:p>
-      <w:pPr>
-        <w:pStyle w:val="Heading1"/>
-        <w:pageBreakBefore/>
-        <w:spacing w:after="160" w:before="240"/>
-      </w:pPr>
-      <w:r>
-        <w:rPr>
-          <w:rFonts w:ascii="Georgia" w:cs="Georgia" w:eastAsia="Georgia" w:hAnsi="Georgia"/>
-          <w:b/>
-          <w:bCs/>
-          <w:color w:val="1D231F"/>
-          <w:sz w:val="32"/>
-          <w:szCs w:val="32"/>
-        </w:rPr>
-        <w:t xml:space="preserve">Appendix III: Evidence Gaps</w:t>
-      </w:r>
-    </w:p>
-    <w:p>
-      <w:pPr>
-        <w:spacing w:after="120" w:line="276"/>
-        <w:jc w:val="both"/>
-      </w:pPr>
-      <w:r>
-        <w:rPr>
-          <w:rFonts w:ascii="Calibri" w:cs="Calibri" w:eastAsia="Calibri" w:hAnsi="Calibri"/>
-          <w:sz w:val="21"/>
-          <w:szCs w:val="21"/>
-        </w:rPr>
-        <w:t xml:space="preserve">1. Boise hotel occupancy/RevPAR 2025–26 (STR data needed).</w:t>
-      </w:r>
-    </w:p>
-    <w:p>
-      <w:pPr>
-        <w:spacing w:after="120" w:line="276"/>
-        <w:jc w:val="both"/>
-      </w:pPr>
-      <w:r>
-        <w:rPr>
-          <w:rFonts w:ascii="Calibri" w:cs="Calibri" w:eastAsia="Calibri" w:hAnsi="Calibri"/>
-          <w:sz w:val="21"/>
-          <w:szCs w:val="21"/>
-        </w:rPr>
-        <w:t xml:space="preserve">2. Ada–Canyon building-permit counts for 2025–H1 2026 (COMPASS/Census BPS pull recommended).</w:t>
-      </w:r>
-    </w:p>
-    <w:p>
-      <w:pPr>
-        <w:spacing w:after="120" w:line="276"/>
-        <w:jc w:val="both"/>
-      </w:pPr>
-      <w:r>
-        <w:rPr>
-          <w:rFonts w:ascii="Calibri" w:cs="Calibri" w:eastAsia="Calibri" w:hAnsi="Calibri"/>
-          <w:sz w:val="21"/>
-          <w:szCs w:val="21"/>
-        </w:rPr>
-        <w:t xml:space="preserve">3. Formal hospital-system hiring-policy statements (none public; visible only in aggregate data).</w:t>
-      </w:r>
-    </w:p>
-    <w:p>
-      <w:pPr>
-        <w:spacing w:after="120" w:line="276"/>
-        <w:jc w:val="both"/>
-      </w:pPr>
-      <w:r>
-        <w:rPr>
-          <w:rFonts w:ascii="Calibri" w:cs="Calibri" w:eastAsia="Calibri" w:hAnsi="Calibri"/>
-          <w:sz w:val="21"/>
-          <w:szCs w:val="21"/>
-        </w:rPr>
-        <w:t xml:space="preserve">4. Quantified immigration-enforcement employment effects for the Boise MSA.</w:t>
-      </w:r>
-    </w:p>
-    <w:p>
-      <w:pPr>
-        <w:spacing w:after="120" w:line="276"/>
-        <w:jc w:val="both"/>
-      </w:pPr>
-      <w:r>
-        <w:rPr>
-          <w:rFonts w:ascii="Calibri" w:cs="Calibri" w:eastAsia="Calibri" w:hAnsi="Calibri"/>
-          <w:sz w:val="21"/>
-          <w:szCs w:val="21"/>
-        </w:rPr>
-        <w:t xml:space="preserve">5. Prelude at Paramount price confirmation (non-disclosure; client holds the actual figure).</w:t>
-      </w:r>
-    </w:p>
-    <w:p>
-      <w:pPr>
-        <w:spacing w:after="120" w:line="276"/>
-        <w:jc w:val="both"/>
-      </w:pPr>
-      <w:r>
-        <w:rPr>
-          <w:rFonts w:ascii="Calibri" w:cs="Calibri" w:eastAsia="Calibri" w:hAnsi="Calibri"/>
-          <w:sz w:val="21"/>
-          <w:szCs w:val="21"/>
-        </w:rPr>
-        <w:t xml:space="preserve">6. Paired Eagle-vs-Ten-Mile land comps (CoStar pull recommended).</w:t>
+        <w:t xml:space="preserve">5. (Valuation items moved to the separate `valuation/` workstream.)</w:t>
       </w:r>
     </w:p>
     <w:p>
@@ -12368,7 +10737,7 @@
           <w:sz w:val="21"/>
           <w:szCs w:val="21"/>
         </w:rPr>
-        <w:t xml:space="preserve">This paper synthesizes three commissioned research streams (national causes; Boise local causes; Class A comps &amp; replacement cost — preserved in full with URLs as deal-file appendices G, H, and I), the two prior research streams behind the v2 memo (appendices A–D), and original computation (appendix E + `t3m_sectors.json`). Principal primary sources: BLS (CES flat files, QCEW API, BED, OEWS, JOLTS, benchmark documentation), FRED, Idaho Department of Labor (releases, EORAC 2026 outlook), Idaho Capital Sun, BoiseDev, Idaho Statesman/Press, Idaho EdNews, Dallas/St. Louis/Cleveland/Chicago/KC Federal Reserve Banks, Brookings/AEI, CBO, Yale Budget Lab, Stanford Digital Economy Lab, IPA/Marcus &amp; Millichap, Lee &amp; Associates, TOK Commercial, CBRE, Colliers, MMG, REBusinessOnline, Multi-Housing News, Multifamily Dive, and City of Meridian records. ~200 distinct citations across the appendix set.</w:t>
+        <w:t xml:space="preserve">This paper synthesizes two commissioned research streams (national causes; Boise local causes — preserved in full with URLs as deal-file appendices G and H; a third stream on Class A comps/replacement cost was moved to the deal file's `valuation/` folder as a separate workstream), the prior research streams behind the v2 memo (appendices A–D), Placer.ai client-provided migration data (appendix K, raw exports in `data/placerai/`), and original computation (appendices E and J + `t3m_sectors.json`, `crossmetro.json`). Principal primary sources: BLS (CES flat files, QCEW API, BED, OEWS, JOLTS, benchmark documentation), FRED, Idaho Department of Labor (releases, EORAC 2026 outlook), Placer.ai, Idaho Capital Sun, BoiseDev, Idaho Statesman/Press, Idaho EdNews, Dallas/St. Louis/Cleveland/Chicago/KC Federal Reserve Banks, Brookings/AEI, CBO, Yale Budget Lab, Stanford Digital Economy Lab, and City of Meridian records. ~200 distinct citations across the appendix set.</w:t>
       </w:r>
     </w:p>
     <w:sectPr>

</xml_diff>